<commit_message>
deepseek runs task 2,3,4,5 done and folder structure organized
</commit_message>
<xml_diff>
--- a/Prompts (2).docx
+++ b/Prompts (2).docx
@@ -61,10 +61,7 @@
         <w:t>- Do not generate example usage, main blocks, or print statements unless asked.</w:t>
       </w:r>
     </w:p>
-    <w:p>
-      <w:bookmarkStart w:id="0" w:name="_GoBack"/>
-      <w:bookmarkEnd w:id="0"/>
-    </w:p>
+    <w:p/>
     <w:p>
       <w:r>
         <w:t>Error Handling:</w:t>
@@ -378,6 +375,30 @@
       </w:r>
     </w:p>
     <w:p>
+      <w:pPr>
+        <w:pStyle w:val="ListParagraph"/>
+        <w:numPr>
+          <w:ilvl w:val="0"/>
+          <w:numId w:val="10"/>
+        </w:numPr>
+      </w:pPr>
+      <w:r>
+        <w:t>Do not sort the final output list.</w:t>
+      </w:r>
+    </w:p>
+    <w:p>
+      <w:pPr>
+        <w:pStyle w:val="ListParagraph"/>
+        <w:numPr>
+          <w:ilvl w:val="0"/>
+          <w:numId w:val="10"/>
+        </w:numPr>
+      </w:pPr>
+      <w:r>
+        <w:t>Prioritize dictionaries , lists over sets.</w:t>
+      </w:r>
+    </w:p>
+    <w:p>
       <w:r>
         <w:t>Known Edge cases</w:t>
       </w:r>
@@ -391,7 +412,13 @@
         </w:numPr>
       </w:pPr>
       <w:r>
-        <w:t>If all brand values are nil or "" , the result is []</w:t>
+        <w:t xml:space="preserve">If all brand values are </w:t>
+      </w:r>
+      <w:r>
+        <w:t>None</w:t>
+      </w:r>
+      <w:r>
+        <w:t xml:space="preserve"> or "" , the result is []</w:t>
       </w:r>
     </w:p>
     <w:p>
@@ -403,6 +430,7 @@
         </w:numPr>
       </w:pPr>
       <w:r>
+        <w:lastRenderedPageBreak/>
         <w:t>If get_all_products /0 returns [] , the result is also []</w:t>
       </w:r>
     </w:p>
@@ -415,7 +443,6 @@
         </w:numPr>
       </w:pPr>
       <w:r>
-        <w:lastRenderedPageBreak/>
         <w:t>If the same brand appears in lower and upper case , it is</w:t>
       </w:r>
       <w:r>
@@ -628,7 +655,6 @@
     </w:p>
     <w:p>
       <w:r>
-        <w:lastRenderedPageBreak/>
         <w:t>Module Name: Get_Average_Price</w:t>
       </w:r>
       <w:r>
@@ -937,7 +963,16 @@
         </w:numPr>
       </w:pPr>
       <w:r>
-        <w:t>If all products have price : nil , returns nil</w:t>
+        <w:t xml:space="preserve">If all products have price : </w:t>
+      </w:r>
+      <w:r>
+        <w:t>None</w:t>
+      </w:r>
+      <w:r>
+        <w:t xml:space="preserve"> , returns </w:t>
+      </w:r>
+      <w:r>
+        <w:t>None</w:t>
       </w:r>
     </w:p>
     <w:p>
@@ -978,6 +1013,7 @@
         <w:ind w:left="1440"/>
       </w:pPr>
       <w:r>
+        <w:lastRenderedPageBreak/>
         <w:t>price_list</w:t>
       </w:r>
       <w:r>
@@ -1065,7 +1101,6 @@
         <w:ind w:left="1440"/>
       </w:pPr>
       <w:r>
-        <w:lastRenderedPageBreak/>
         <w:t>Average = 600 / 3 = 200.0</w:t>
       </w:r>
     </w:p>
@@ -1373,10 +1408,7 @@
         <w:t xml:space="preserve"> </w:t>
       </w:r>
       <w:r>
-        <w:t>get_</w:t>
-      </w:r>
-      <w:r>
-        <w:t>min</w:t>
+        <w:t>get_min_2_attributes</w:t>
       </w:r>
     </w:p>
     <w:p>
@@ -1517,7 +1549,13 @@
       </w:r>
       <w:r>
         <w:tab/>
-        <w:t>The minimum non - nil value of the given attribute across</w:t>
+        <w:t xml:space="preserve">The minimum non - </w:t>
+      </w:r>
+      <w:r>
+        <w:t>None</w:t>
+      </w:r>
+      <w:r>
+        <w:t xml:space="preserve"> value of the given attribute across</w:t>
       </w:r>
     </w:p>
     <w:p>
@@ -1529,7 +1567,25 @@
       </w:r>
       <w:r>
         <w:tab/>
-        <w:t>Returns nil if no products contain a valid value for that attribute .</w:t>
+        <w:t xml:space="preserve">Returns </w:t>
+      </w:r>
+      <w:r>
+        <w:t>None</w:t>
+      </w:r>
+      <w:r>
+        <w:t xml:space="preserve"> if no products contain a valid value for that attribute .</w:t>
+      </w:r>
+    </w:p>
+    <w:p>
+      <w:pPr>
+        <w:ind w:firstLine="720"/>
+      </w:pPr>
+      <w:r>
+        <w:t>o</w:t>
+      </w:r>
+      <w:r>
+        <w:tab/>
+        <w:t>Returns value in float with rounded to 2 decimals .</w:t>
       </w:r>
     </w:p>
     <w:p/>
@@ -1547,7 +1603,14 @@
         </w:numPr>
       </w:pPr>
       <w:r>
-        <w:t>Only products where get_min_2_attributes( data, dict_search) is not nil are considered .</w:t>
+        <w:lastRenderedPageBreak/>
+        <w:t xml:space="preserve">Only products where get_min_2_attributes( data, dict_search) is not </w:t>
+      </w:r>
+      <w:r>
+        <w:t>None</w:t>
+      </w:r>
+      <w:r>
+        <w:t xml:space="preserve"> are considered .</w:t>
       </w:r>
     </w:p>
     <w:p>
@@ -1571,7 +1634,6 @@
         </w:numPr>
       </w:pPr>
       <w:r>
-        <w:lastRenderedPageBreak/>
         <w:t>Values must be comparable using Enum . min /1.</w:t>
       </w:r>
       <w:r>
@@ -1613,7 +1675,13 @@
         </w:numPr>
       </w:pPr>
       <w:r>
-        <w:t>If products is an empty list , the result is also nil .</w:t>
+        <w:t xml:space="preserve">If products is an empty list , the result is also </w:t>
+      </w:r>
+      <w:r>
+        <w:t>None</w:t>
+      </w:r>
+      <w:r>
+        <w:t xml:space="preserve"> .</w:t>
       </w:r>
       <w:r>
         <w:cr/>
@@ -1719,7 +1787,6 @@
     </w:p>
     <w:p>
       <w:r>
-        <w:lastRenderedPageBreak/>
         <w:t>    {"price": 49.99, "battery_life": 4.0},</w:t>
       </w:r>
     </w:p>
@@ -1751,7 +1818,10 @@
     </w:p>
     <w:p>
       <w:r>
-        <w:t># =&gt; nil</w:t>
+        <w:t xml:space="preserve"># =&gt; </w:t>
+      </w:r>
+      <w:r>
+        <w:t>None</w:t>
       </w:r>
     </w:p>
     <w:p/>
@@ -1765,7 +1835,16 @@
         <w:t>    {</w:t>
       </w:r>
       <w:r>
-        <w:t>title:”A”</w:t>
+        <w:t>“</w:t>
+      </w:r>
+      <w:r>
+        <w:t>title</w:t>
+      </w:r>
+      <w:r>
+        <w:t>”</w:t>
+      </w:r>
+      <w:r>
+        <w:t>:”A”</w:t>
       </w:r>
       <w:r>
         <w:t>},</w:t>
@@ -1779,7 +1858,16 @@
         <w:t xml:space="preserve"> </w:t>
       </w:r>
       <w:r>
-        <w:t>title:”B”</w:t>
+        <w:t>“</w:t>
+      </w:r>
+      <w:r>
+        <w:t>title</w:t>
+      </w:r>
+      <w:r>
+        <w:t>”</w:t>
+      </w:r>
+      <w:r>
+        <w:t>:”B”</w:t>
       </w:r>
       <w:r>
         <w:t>},</w:t>
@@ -1790,10 +1878,19 @@
         <w:t>    {</w:t>
       </w:r>
       <w:r>
+        <w:t>“</w:t>
+      </w:r>
+      <w:r>
         <w:t xml:space="preserve"> </w:t>
       </w:r>
       <w:r>
-        <w:t>title:”C”</w:t>
+        <w:t>title</w:t>
+      </w:r>
+      <w:r>
+        <w:t>”</w:t>
+      </w:r>
+      <w:r>
+        <w:t>:”C”</w:t>
       </w:r>
       <w:r>
         <w:t xml:space="preserve"> </w:t>
@@ -1810,7 +1907,13 @@
         <w:t>title”:”None”</w:t>
       </w:r>
       <w:r>
-        <w:t xml:space="preserve">}                   </w:t>
+        <w:t>}</w:t>
+      </w:r>
+      <w:r>
+        <w:t>, ‘title’</w:t>
+      </w:r>
+      <w:r>
+        <w:t xml:space="preserve">                   </w:t>
       </w:r>
     </w:p>
     <w:p>
@@ -1820,7 +1923,10 @@
     </w:p>
     <w:p>
       <w:r>
-        <w:t># =&gt; nil</w:t>
+        <w:t xml:space="preserve"># =&gt; </w:t>
+      </w:r>
+      <w:r>
+        <w:t>None</w:t>
       </w:r>
     </w:p>
     <w:p/>
@@ -1865,74 +1971,15 @@
       </w:pPr>
     </w:p>
     <w:p>
-      <w:pPr>
-        <w:pStyle w:val="ListParagraph"/>
-        <w:ind w:left="1080"/>
-      </w:pPr>
-    </w:p>
-    <w:p>
-      <w:pPr>
-        <w:pStyle w:val="ListParagraph"/>
-        <w:ind w:left="1080"/>
-      </w:pPr>
-    </w:p>
-    <w:p>
-      <w:pPr>
-        <w:pStyle w:val="ListParagraph"/>
-        <w:ind w:left="1080"/>
-      </w:pPr>
-    </w:p>
-    <w:p>
-      <w:pPr>
-        <w:pStyle w:val="ListParagraph"/>
-        <w:ind w:left="1080"/>
-      </w:pPr>
-    </w:p>
-    <w:p>
-      <w:pPr>
-        <w:pStyle w:val="ListParagraph"/>
-        <w:ind w:left="1080"/>
-      </w:pPr>
-    </w:p>
-    <w:p>
-      <w:pPr>
-        <w:pStyle w:val="ListParagraph"/>
-        <w:ind w:left="1080"/>
-      </w:pPr>
-    </w:p>
-    <w:p>
-      <w:pPr>
-        <w:pStyle w:val="ListParagraph"/>
-        <w:ind w:left="1080"/>
-      </w:pPr>
-    </w:p>
-    <w:p>
-      <w:pPr>
-        <w:pStyle w:val="ListParagraph"/>
-        <w:ind w:left="1080"/>
-      </w:pPr>
-    </w:p>
-    <w:p>
-      <w:pPr>
-        <w:pStyle w:val="ListParagraph"/>
-        <w:ind w:left="1080"/>
-      </w:pPr>
-    </w:p>
-    <w:p>
-      <w:pPr>
-        <w:pStyle w:val="ListParagraph"/>
-        <w:ind w:left="1080"/>
-      </w:pPr>
-    </w:p>
-    <w:p>
-      <w:pPr>
-        <w:pStyle w:val="ListParagraph"/>
-        <w:ind w:left="1080"/>
-      </w:pPr>
-    </w:p>
-    <w:p>
-      <w:r>
-        <w:t>Module Name: get_reading_duration</w:t>
+      <w:r>
+        <w:lastRenderedPageBreak/>
+        <w:t>Module Name: get_</w:t>
+      </w:r>
+      <w:r>
+        <w:t>read</w:t>
+      </w:r>
+      <w:r>
+        <w:t>_duration</w:t>
       </w:r>
     </w:p>
     <w:p>
@@ -1951,7 +1998,13 @@
         <w:t xml:space="preserve"> </w:t>
       </w:r>
       <w:r>
-        <w:t>get_reading_duration</w:t>
+        <w:t>get_</w:t>
+      </w:r>
+      <w:r>
+        <w:t>read</w:t>
+      </w:r>
+      <w:r>
+        <w:t>_duration</w:t>
       </w:r>
     </w:p>
     <w:p>
@@ -2056,7 +2109,13 @@
         </w:numPr>
       </w:pPr>
       <w:r>
-        <w:t>Estimated reading time in minutes , rounded up ( minimum of 1) .</w:t>
+        <w:t xml:space="preserve">Estimated </w:t>
+      </w:r>
+      <w:r>
+        <w:t>read</w:t>
+      </w:r>
+      <w:r>
+        <w:t xml:space="preserve"> time in minutes , rounded up ( minimum of 1) .</w:t>
       </w:r>
     </w:p>
     <w:p>
@@ -2073,7 +2132,13 @@
         </w:numPr>
       </w:pPr>
       <w:r>
-        <w:t xml:space="preserve">Assumes an average reading speed of 200 words per minute </w:t>
+        <w:t xml:space="preserve">Assumes an average </w:t>
+      </w:r>
+      <w:r>
+        <w:t>read</w:t>
+      </w:r>
+      <w:r>
+        <w:t xml:space="preserve"> speed of 200 words per minute </w:t>
       </w:r>
     </w:p>
     <w:p>
@@ -2156,9 +2221,6 @@
         <w:ind w:left="1440"/>
       </w:pPr>
     </w:p>
-    <w:p/>
-    <w:p/>
-    <w:p/>
     <w:p>
       <w:r>
         <w:t>Example Calls &amp; Expected Outputs</w:t>
@@ -2179,7 +2241,13 @@
         <w:cr/>
       </w:r>
       <w:r>
-        <w:t>get_reading_duration (" This is a simple blog post with about fifty words total ...")</w:t>
+        <w:t>get_</w:t>
+      </w:r>
+      <w:r>
+        <w:t>read</w:t>
+      </w:r>
+      <w:r>
+        <w:t>_duration (" This is a simple blog post with about fifty words total ...")</w:t>
       </w:r>
       <w:r>
         <w:cr/>
@@ -2207,7 +2275,13 @@
         <w:ind w:left="1080"/>
       </w:pPr>
       <w:r>
-        <w:t>get_reading_duration ( String . duplicate (" word ", 450) )</w:t>
+        <w:t>get_</w:t>
+      </w:r>
+      <w:r>
+        <w:t>read</w:t>
+      </w:r>
+      <w:r>
+        <w:t>_duration ( String . duplicate (" word ", 450) )</w:t>
       </w:r>
     </w:p>
     <w:p>
@@ -2237,7 +2311,14 @@
         <w:ind w:left="1080"/>
       </w:pPr>
       <w:r>
-        <w:t>get_reading_duration ("")</w:t>
+        <w:lastRenderedPageBreak/>
+        <w:t>get_</w:t>
+      </w:r>
+      <w:r>
+        <w:t>read</w:t>
+      </w:r>
+      <w:r>
+        <w:t>_duration ("")</w:t>
       </w:r>
     </w:p>
     <w:p>
@@ -2402,6 +2483,42 @@
         <w:ind w:left="1080"/>
       </w:pPr>
     </w:p>
+    <w:p>
+      <w:pPr>
+        <w:pStyle w:val="ListParagraph"/>
+        <w:ind w:left="1080"/>
+      </w:pPr>
+    </w:p>
+    <w:p>
+      <w:pPr>
+        <w:pStyle w:val="ListParagraph"/>
+        <w:ind w:left="1080"/>
+      </w:pPr>
+    </w:p>
+    <w:p>
+      <w:pPr>
+        <w:pStyle w:val="ListParagraph"/>
+        <w:ind w:left="1080"/>
+      </w:pPr>
+    </w:p>
+    <w:p>
+      <w:pPr>
+        <w:pStyle w:val="ListParagraph"/>
+        <w:ind w:left="1080"/>
+      </w:pPr>
+    </w:p>
+    <w:p>
+      <w:pPr>
+        <w:pStyle w:val="ListParagraph"/>
+        <w:ind w:left="1080"/>
+      </w:pPr>
+    </w:p>
+    <w:p>
+      <w:pPr>
+        <w:pStyle w:val="ListParagraph"/>
+        <w:ind w:left="1080"/>
+      </w:pPr>
+    </w:p>
     <w:p/>
     <w:p>
       <w:pPr>
@@ -2411,6 +2528,7 @@
     </w:p>
     <w:p>
       <w:r>
+        <w:lastRenderedPageBreak/>
         <w:t>Module Name: Form Validation</w:t>
       </w:r>
     </w:p>
@@ -2430,7 +2548,10 @@
         <w:t xml:space="preserve"> </w:t>
       </w:r>
       <w:r>
-        <w:t>Validate_contract_form</w:t>
+        <w:t>Validate</w:t>
+      </w:r>
+      <w:r>
+        <w:t>_form</w:t>
       </w:r>
     </w:p>
     <w:p>
@@ -2451,47 +2572,8 @@
       </w:r>
     </w:p>
     <w:p>
-      <w:pPr>
-        <w:pStyle w:val="ListParagraph"/>
-        <w:numPr>
-          <w:ilvl w:val="0"/>
-          <w:numId w:val="1"/>
-        </w:numPr>
-      </w:pPr>
-      <w:r>
-        <w:t>Returns true if the data is valid or returns false with dedicated field errors otherwise.</w:t>
-      </w:r>
-    </w:p>
-    <w:p>
       <w:r>
         <w:t>Inputs</w:t>
-      </w:r>
-    </w:p>
-    <w:p>
-      <w:pPr>
-        <w:pStyle w:val="ListParagraph"/>
-        <w:numPr>
-          <w:ilvl w:val="1"/>
-          <w:numId w:val="3"/>
-        </w:numPr>
-      </w:pPr>
-      <w:r>
-        <w:t>Form Data</w:t>
-      </w:r>
-    </w:p>
-    <w:p>
-      <w:pPr>
-        <w:pStyle w:val="ListParagraph"/>
-        <w:numPr>
-          <w:ilvl w:val="2"/>
-          <w:numId w:val="3"/>
-        </w:numPr>
-      </w:pPr>
-      <w:r>
-        <w:t xml:space="preserve">Type: </w:t>
-      </w:r>
-      <w:r>
-        <w:t xml:space="preserve"> String </w:t>
       </w:r>
     </w:p>
     <w:p>
@@ -2700,7 +2782,10 @@
         <w:t>=&gt;</w:t>
       </w:r>
       <w:r>
-        <w:t xml:space="preserve"> true</w:t>
+        <w:t xml:space="preserve"> T</w:t>
+      </w:r>
+      <w:r>
+        <w:t>rue</w:t>
       </w:r>
     </w:p>
     <w:p>
@@ -2730,13 +2815,52 @@
         <w:ind w:right="-563"/>
       </w:pPr>
       <w:r>
-        <w:t>Form is valid. Details are {</w:t>
-      </w:r>
-      <w:r>
-        <w:t>first_name,last_name</w:t>
-      </w:r>
-      <w:r>
-        <w:t>,email,subject,message,privacy}</w:t>
+        <w:t xml:space="preserve">Should </w:t>
+      </w:r>
+      <w:r>
+        <w:t>return</w:t>
+      </w:r>
+      <w:r>
+        <w:t>:</w:t>
+      </w:r>
+    </w:p>
+    <w:p>
+      <w:pPr>
+        <w:pStyle w:val="ListParagraph"/>
+        <w:ind w:left="2160" w:right="-563"/>
+      </w:pPr>
+      <w:r>
+        <w:t>Form is valid. Details:{first_name},{last_name},{email},{subject},{message},{privacy</w:t>
+      </w:r>
+      <w:r>
+        <w:t>}</w:t>
+      </w:r>
+    </w:p>
+    <w:p>
+      <w:pPr>
+        <w:pStyle w:val="ListParagraph"/>
+        <w:numPr>
+          <w:ilvl w:val="0"/>
+          <w:numId w:val="9"/>
+        </w:numPr>
+      </w:pPr>
+      <w:r>
+        <w:t>Failure</w:t>
+      </w:r>
+      <w:r>
+        <w:t>:</w:t>
+      </w:r>
+    </w:p>
+    <w:p>
+      <w:pPr>
+        <w:pStyle w:val="ListParagraph"/>
+        <w:numPr>
+          <w:ilvl w:val="0"/>
+          <w:numId w:val="9"/>
+        </w:numPr>
+      </w:pPr>
+      <w:r>
+        <w:t>On failure always return a list of error messages , even if there is only one error.</w:t>
       </w:r>
     </w:p>
     <w:p>
@@ -2748,23 +2872,13 @@
         </w:numPr>
       </w:pPr>
       <w:r>
-        <w:t>All validations passed</w:t>
-      </w:r>
-    </w:p>
-    <w:p>
-      <w:pPr>
-        <w:pStyle w:val="ListParagraph"/>
-        <w:numPr>
-          <w:ilvl w:val="0"/>
-          <w:numId w:val="9"/>
-        </w:numPr>
-      </w:pPr>
-      <w:r>
-        <w:lastRenderedPageBreak/>
-        <w:t>Failure</w:t>
-      </w:r>
-      <w:r>
-        <w:t>:</w:t>
+        <w:t>Please T</w:t>
+      </w:r>
+      <w:r>
+        <w:t xml:space="preserve">ype First </w:t>
+      </w:r>
+      <w:r>
+        <w:t xml:space="preserve">Name </w:t>
       </w:r>
     </w:p>
     <w:p>
@@ -2776,7 +2890,13 @@
         </w:numPr>
       </w:pPr>
       <w:r>
-        <w:t>Please fill all the fields and try again</w:t>
+        <w:t>Please T</w:t>
+      </w:r>
+      <w:r>
+        <w:t xml:space="preserve">ype Last </w:t>
+      </w:r>
+      <w:r>
+        <w:t xml:space="preserve">Name </w:t>
       </w:r>
     </w:p>
     <w:p>
@@ -2788,10 +2908,7 @@
         </w:numPr>
       </w:pPr>
       <w:r>
-        <w:t>Please type First_</w:t>
-      </w:r>
-      <w:r>
-        <w:t xml:space="preserve">Name </w:t>
+        <w:t>Please Type EmailID</w:t>
       </w:r>
     </w:p>
     <w:p>
@@ -2803,10 +2920,7 @@
         </w:numPr>
       </w:pPr>
       <w:r>
-        <w:t>Please type Last_</w:t>
-      </w:r>
-      <w:r>
-        <w:t xml:space="preserve">Name </w:t>
+        <w:t>Email standards not followed</w:t>
       </w:r>
     </w:p>
     <w:p>
@@ -2818,7 +2932,7 @@
         </w:numPr>
       </w:pPr>
       <w:r>
-        <w:t>Please Type EmailID</w:t>
+        <w:t>Please Type Subject</w:t>
       </w:r>
     </w:p>
     <w:p>
@@ -2830,7 +2944,7 @@
         </w:numPr>
       </w:pPr>
       <w:r>
-        <w:t>Email standards not followed</w:t>
+        <w:t>Please Type Message</w:t>
       </w:r>
     </w:p>
     <w:p>
@@ -2842,7 +2956,13 @@
         </w:numPr>
       </w:pPr>
       <w:r>
-        <w:t>Please Type Subject</w:t>
+        <w:t>Please confirm the privacy policy</w:t>
+      </w:r>
+    </w:p>
+    <w:p/>
+    <w:p>
+      <w:r>
+        <w:t>Constraints</w:t>
       </w:r>
     </w:p>
     <w:p>
@@ -2854,370 +2974,389 @@
         </w:numPr>
       </w:pPr>
       <w:r>
-        <w:t>Please Type Message</w:t>
-      </w:r>
-    </w:p>
-    <w:p>
-      <w:pPr>
-        <w:pStyle w:val="ListParagraph"/>
-        <w:numPr>
-          <w:ilvl w:val="1"/>
-          <w:numId w:val="9"/>
-        </w:numPr>
-      </w:pPr>
+        <w:t>“first_name”,</w:t>
+      </w:r>
+      <w:r>
+        <w:t>"</w:t>
+      </w:r>
+      <w:r>
+        <w:t>last_</w:t>
+      </w:r>
+      <w:r>
+        <w:t>name " , " email ", " subject " , " message " must be non - empty after trimming whitespace</w:t>
+      </w:r>
+      <w:r>
+        <w:t>. A</w:t>
+      </w:r>
+      <w:r>
+        <w:t>fter trimming email and it turns out to be empty then return ”</w:t>
+      </w:r>
+      <w:r>
+        <w:t>Please Type EmailID</w:t>
+      </w:r>
+      <w:r>
+        <w:t>”</w:t>
+      </w:r>
+    </w:p>
+    <w:p>
+      <w:pPr>
+        <w:pStyle w:val="ListParagraph"/>
+        <w:numPr>
+          <w:ilvl w:val="0"/>
+          <w:numId w:val="10"/>
+        </w:numPr>
+      </w:pPr>
+      <w:r>
+        <w:t>" email " must match the regex ~r /^[^\ s@ ]+ @ [^\ s@ ]+\.[^\ s@ ]+ $/</w:t>
+      </w:r>
+      <w:r>
+        <w:t xml:space="preserve"> and should verify it only after trimming whitespaces</w:t>
+      </w:r>
+      <w:bookmarkStart w:id="0" w:name="_GoBack"/>
+      <w:bookmarkEnd w:id="0"/>
+      <w:r>
+        <w:t>.</w:t>
+      </w:r>
+    </w:p>
+    <w:p>
+      <w:pPr>
+        <w:pStyle w:val="ListParagraph"/>
+        <w:numPr>
+          <w:ilvl w:val="0"/>
+          <w:numId w:val="10"/>
+        </w:numPr>
+      </w:pPr>
+      <w:r>
+        <w:t>error message for invalid ( non - empty ) email</w:t>
+      </w:r>
+      <w:r>
+        <w:t xml:space="preserve"> : </w:t>
+      </w:r>
+      <w:r>
+        <w:t>Email standards not followed</w:t>
+      </w:r>
+    </w:p>
+    <w:p>
+      <w:pPr>
+        <w:pStyle w:val="ListParagraph"/>
+        <w:numPr>
+          <w:ilvl w:val="0"/>
+          <w:numId w:val="10"/>
+        </w:numPr>
+      </w:pPr>
+      <w:r>
+        <w:t>error message for missing or invalid privacy : Please confirm the privacy policy</w:t>
+      </w:r>
+    </w:p>
+    <w:p>
+      <w:pPr>
+        <w:pStyle w:val="ListParagraph"/>
+        <w:numPr>
+          <w:ilvl w:val="0"/>
+          <w:numId w:val="10"/>
+        </w:numPr>
+      </w:pPr>
+      <w:r>
+        <w:t>Error messages are collected as a list and multiple error messages are appended into that list.</w:t>
+      </w:r>
+    </w:p>
+    <w:p>
+      <w:pPr>
+        <w:pStyle w:val="ListParagraph"/>
+        <w:numPr>
+          <w:ilvl w:val="0"/>
+          <w:numId w:val="10"/>
+        </w:numPr>
+      </w:pPr>
+      <w:r>
+        <w:t xml:space="preserve">" privacy " must be </w:t>
+      </w:r>
+      <w:r>
+        <w:t>True</w:t>
+      </w:r>
+      <w:r>
+        <w:t>.</w:t>
+      </w:r>
+      <w:r>
+        <w:t xml:space="preserve"> </w:t>
+      </w:r>
+      <w:r>
+        <w:t xml:space="preserve">Error message for privacy not being True: </w:t>
+      </w:r>
       <w:r>
         <w:t>Please confirm the privacy policy</w:t>
       </w:r>
     </w:p>
+    <w:p>
+      <w:pPr>
+        <w:pStyle w:val="ListParagraph"/>
+        <w:numPr>
+          <w:ilvl w:val="0"/>
+          <w:numId w:val="10"/>
+        </w:numPr>
+      </w:pPr>
+      <w:r>
+        <w:t xml:space="preserve">Validations are performed in the exact order: </w:t>
+      </w:r>
+      <w:r>
+        <w:t>First_Name, Last_Name, Email, Subject, Message, Privacy.</w:t>
+      </w:r>
+    </w:p>
+    <w:p>
+      <w:pPr>
+        <w:pStyle w:val="ListParagraph"/>
+        <w:numPr>
+          <w:ilvl w:val="0"/>
+          <w:numId w:val="10"/>
+        </w:numPr>
+      </w:pPr>
+      <w:r>
+        <w:t>Error messages should be appended in the same exact order as well</w:t>
+      </w:r>
+    </w:p>
+    <w:p>
+      <w:r>
+        <w:t>Known Edge cases</w:t>
+      </w:r>
+    </w:p>
+    <w:p>
+      <w:pPr>
+        <w:pStyle w:val="ListParagraph"/>
+        <w:numPr>
+          <w:ilvl w:val="0"/>
+          <w:numId w:val="11"/>
+        </w:numPr>
+      </w:pPr>
+      <w:r>
+        <w:t>Missing or blank fields ( including those with only whitespace) fail validation .</w:t>
+      </w:r>
+    </w:p>
+    <w:p>
+      <w:pPr>
+        <w:pStyle w:val="ListParagraph"/>
+        <w:numPr>
+          <w:ilvl w:val="0"/>
+          <w:numId w:val="11"/>
+        </w:numPr>
+      </w:pPr>
+      <w:r>
+        <w:t>" privacy " must be</w:t>
+      </w:r>
+      <w:r>
+        <w:t xml:space="preserve"> </w:t>
+      </w:r>
+      <w:r>
+        <w:t xml:space="preserve">a boolean : </w:t>
+      </w:r>
+      <w:r>
+        <w:t xml:space="preserve">True  </w:t>
+      </w:r>
+      <w:r>
+        <w:t>. Failure to that should return the error message.</w:t>
+      </w:r>
+    </w:p>
+    <w:p>
+      <w:pPr>
+        <w:pStyle w:val="ListParagraph"/>
+        <w:numPr>
+          <w:ilvl w:val="0"/>
+          <w:numId w:val="11"/>
+        </w:numPr>
+      </w:pPr>
+      <w:r>
+        <w:t>If multiple fields are invalid , all errors are returned at</w:t>
+      </w:r>
+      <w:r>
+        <w:t xml:space="preserve"> </w:t>
+      </w:r>
+      <w:r>
+        <w:t>once .</w:t>
+      </w:r>
+    </w:p>
+    <w:p>
+      <w:pPr>
+        <w:pStyle w:val="ListParagraph"/>
+        <w:numPr>
+          <w:ilvl w:val="0"/>
+          <w:numId w:val="11"/>
+        </w:numPr>
+      </w:pPr>
+      <w:r>
+        <w:t>if " email " is empty it will not be validated against the</w:t>
+      </w:r>
+      <w:r>
+        <w:t xml:space="preserve"> </w:t>
+      </w:r>
+      <w:r>
+        <w:t xml:space="preserve">regex and only show the error message for being blank </w:t>
+      </w:r>
+      <w:r>
+        <w:cr/>
+      </w:r>
+    </w:p>
+    <w:p>
+      <w:pPr>
+        <w:pStyle w:val="ListParagraph"/>
+        <w:ind w:left="1440"/>
+      </w:pPr>
+    </w:p>
+    <w:p>
+      <w:r>
+        <w:t>Example Calls &amp; Expected Outputs</w:t>
+      </w:r>
+    </w:p>
+    <w:p>
+      <w:pPr>
+        <w:pStyle w:val="ListParagraph"/>
+        <w:ind w:left="1080"/>
+      </w:pPr>
+      <w:r>
+        <w:t xml:space="preserve">1. </w:t>
+      </w:r>
+      <w:r>
+        <w:t xml:space="preserve">Normal </w:t>
+      </w:r>
+      <w:r>
+        <w:t xml:space="preserve">Functionality </w:t>
+      </w:r>
+      <w:r>
+        <w:cr/>
+      </w:r>
+      <w:r>
+        <w:t xml:space="preserve"> validate_form("Alexa","James","abc@gmail.com","Question","Hallo!",True)</w:t>
+      </w:r>
+    </w:p>
+    <w:p>
+      <w:pPr>
+        <w:pStyle w:val="ListParagraph"/>
+        <w:ind w:left="1080" w:right="-563"/>
+      </w:pPr>
+      <w:r>
+        <w:t xml:space="preserve"># =&gt; </w:t>
+      </w:r>
+      <w:r>
+        <w:t>Form is valid. Details:Alexa,James,abc@gmail.com,Question,Hallo!,True</w:t>
+      </w:r>
+    </w:p>
+    <w:p>
+      <w:pPr>
+        <w:pStyle w:val="ListParagraph"/>
+        <w:ind w:left="1080" w:right="-563"/>
+      </w:pPr>
+      <w:r>
+        <w:t xml:space="preserve">2. </w:t>
+      </w:r>
+      <w:r>
+        <w:t>Rejecting</w:t>
+      </w:r>
+      <w:r>
+        <w:t xml:space="preserve"> Privacy Policy</w:t>
+      </w:r>
+    </w:p>
+    <w:p>
+      <w:pPr>
+        <w:pStyle w:val="ListParagraph"/>
+        <w:ind w:left="1080"/>
+      </w:pPr>
+      <w:r>
+        <w:t>validate_form("Alex"</w:t>
+      </w:r>
+      <w:r>
+        <w:t>,”</w:t>
+      </w:r>
+      <w:r>
+        <w:t xml:space="preserve"> </w:t>
+      </w:r>
+      <w:r>
+        <w:t>John”</w:t>
+      </w:r>
+      <w:r>
+        <w:t>,"abc@gmail.net","Question","Hallo!",False)</w:t>
+      </w:r>
+    </w:p>
+    <w:p>
+      <w:pPr>
+        <w:pStyle w:val="ListParagraph"/>
+        <w:ind w:left="1080"/>
+      </w:pPr>
+      <w:r>
+        <w:t>#=&gt;</w:t>
+      </w:r>
+      <w:r>
+        <w:t xml:space="preserve"> </w:t>
+      </w:r>
+      <w:r>
+        <w:t>[</w:t>
+      </w:r>
+      <w:r>
+        <w:t>"Please confirm the privacy policy"</w:t>
+      </w:r>
+      <w:r>
+        <w:t>]</w:t>
+      </w:r>
+    </w:p>
+    <w:p>
+      <w:pPr>
+        <w:pStyle w:val="ListParagraph"/>
+        <w:ind w:left="1080"/>
+      </w:pPr>
+      <w:r>
+        <w:t>3. Empty body</w:t>
+      </w:r>
+    </w:p>
+    <w:p>
+      <w:pPr>
+        <w:pStyle w:val="ListParagraph"/>
+        <w:ind w:left="1080"/>
+      </w:pPr>
+      <w:r>
+        <w:t>validate_form</w:t>
+      </w:r>
+      <w:r>
+        <w:t>(""</w:t>
+      </w:r>
+      <w:r>
+        <w:t>,</w:t>
+      </w:r>
+      <w:r>
+        <w:t>"","","","",""</w:t>
+      </w:r>
+      <w:r>
+        <w:t>)</w:t>
+      </w:r>
+      <w:r>
+        <w:t xml:space="preserve"> </w:t>
+      </w:r>
+    </w:p>
+    <w:p>
+      <w:pPr>
+        <w:pStyle w:val="ListParagraph"/>
+        <w:ind w:left="1080"/>
+      </w:pPr>
+      <w:r>
+        <w:lastRenderedPageBreak/>
+        <w:t>#=&gt;</w:t>
+      </w:r>
+      <w:r>
+        <w:t xml:space="preserve"> ['Please Type First Name', 'Please Type Last Name', 'Please Type EmailID', 'Please Type Subject', 'Please Type Message', 'Please confirm the privacy policy']</w:t>
+      </w:r>
+    </w:p>
     <w:p/>
     <w:p>
-      <w:r>
-        <w:t>Constraints</w:t>
-      </w:r>
-    </w:p>
-    <w:p>
-      <w:pPr>
-        <w:pStyle w:val="ListParagraph"/>
-        <w:numPr>
-          <w:ilvl w:val="0"/>
-          <w:numId w:val="10"/>
-        </w:numPr>
-      </w:pPr>
-      <w:r>
-        <w:t xml:space="preserve">" privacy " must be exactly </w:t>
-      </w:r>
-      <w:r>
-        <w:t>" T</w:t>
-      </w:r>
-      <w:r>
-        <w:t>rue ".</w:t>
-      </w:r>
-      <w:r>
-        <w:t xml:space="preserve"> </w:t>
-      </w:r>
-    </w:p>
-    <w:p>
-      <w:pPr>
-        <w:pStyle w:val="ListParagraph"/>
-        <w:numPr>
-          <w:ilvl w:val="0"/>
-          <w:numId w:val="10"/>
-        </w:numPr>
-      </w:pPr>
-      <w:r>
-        <w:t>“first_name”,</w:t>
-      </w:r>
-      <w:r>
-        <w:t>"</w:t>
-      </w:r>
-      <w:r>
-        <w:t>last_</w:t>
-      </w:r>
-      <w:r>
-        <w:t>name " , " email ", " subject " , " message " must be non - empty after trimming whitespace</w:t>
-      </w:r>
-      <w:r>
-        <w:t xml:space="preserve"> </w:t>
-      </w:r>
-    </w:p>
-    <w:p>
-      <w:pPr>
-        <w:pStyle w:val="ListParagraph"/>
-        <w:numPr>
-          <w:ilvl w:val="0"/>
-          <w:numId w:val="10"/>
-        </w:numPr>
-      </w:pPr>
-      <w:r>
-        <w:t>" email " must match the regex ~r /^[^\ s@ ]+ @ [^\ s@ ]+\.[^\ s@ ]+ $/.</w:t>
-      </w:r>
-    </w:p>
-    <w:p>
-      <w:pPr>
-        <w:pStyle w:val="ListParagraph"/>
-        <w:numPr>
-          <w:ilvl w:val="0"/>
-          <w:numId w:val="10"/>
-        </w:numPr>
-      </w:pPr>
-      <w:r>
-        <w:t>Only the expected keys are validated ; unknown fields are ignored .</w:t>
-      </w:r>
-      <w:r>
-        <w:t xml:space="preserve">error message if any field is blank or missing </w:t>
-      </w:r>
-      <w:r>
-        <w:t>:</w:t>
-      </w:r>
-      <w:r>
-        <w:t xml:space="preserve"> </w:t>
-      </w:r>
-      <w:r>
-        <w:t>Please fill all the fields and try again</w:t>
-      </w:r>
-      <w:r>
-        <w:t xml:space="preserve"> ,Please type First_</w:t>
-      </w:r>
-      <w:r>
-        <w:t xml:space="preserve">Name </w:t>
-      </w:r>
-      <w:r>
-        <w:t>,Please type Last_</w:t>
-      </w:r>
-      <w:r>
-        <w:t xml:space="preserve">Name </w:t>
-      </w:r>
-      <w:r>
-        <w:t>,</w:t>
-      </w:r>
-      <w:r>
-        <w:t>Please Type EmailID</w:t>
-      </w:r>
-      <w:r>
-        <w:t xml:space="preserve"> etc.</w:t>
-      </w:r>
-    </w:p>
-    <w:p>
-      <w:pPr>
-        <w:pStyle w:val="ListParagraph"/>
-        <w:numPr>
-          <w:ilvl w:val="0"/>
-          <w:numId w:val="10"/>
-        </w:numPr>
-      </w:pPr>
-      <w:r>
-        <w:t>error message for invalid ( non - empty ) email</w:t>
-      </w:r>
-      <w:r>
-        <w:t xml:space="preserve"> : </w:t>
-      </w:r>
-      <w:r>
-        <w:t>Email is invalid</w:t>
-      </w:r>
-    </w:p>
-    <w:p>
-      <w:pPr>
-        <w:pStyle w:val="ListParagraph"/>
-        <w:numPr>
-          <w:ilvl w:val="0"/>
-          <w:numId w:val="10"/>
-        </w:numPr>
-      </w:pPr>
-      <w:r>
-        <w:t>error message for missing or invalid privacy : Please confirm the privacy policy</w:t>
-      </w:r>
-    </w:p>
-    <w:p/>
-    <w:p>
-      <w:r>
-        <w:t>Known Edge cases</w:t>
-      </w:r>
-    </w:p>
-    <w:p>
-      <w:pPr>
-        <w:pStyle w:val="ListParagraph"/>
-        <w:numPr>
-          <w:ilvl w:val="0"/>
-          <w:numId w:val="11"/>
-        </w:numPr>
-      </w:pPr>
-      <w:r>
-        <w:t>Missing or blank fields ( including those with only whitespace) fail validation .</w:t>
-      </w:r>
-    </w:p>
-    <w:p>
-      <w:pPr>
-        <w:pStyle w:val="ListParagraph"/>
-        <w:numPr>
-          <w:ilvl w:val="0"/>
-          <w:numId w:val="11"/>
-        </w:numPr>
-      </w:pPr>
-      <w:r>
-        <w:t>" privacy " must match " true " exactly , not " True ", true , or any</w:t>
-      </w:r>
-      <w:r>
-        <w:t xml:space="preserve"> </w:t>
-      </w:r>
-      <w:r>
-        <w:t>other variant .</w:t>
-      </w:r>
-    </w:p>
-    <w:p>
-      <w:pPr>
-        <w:pStyle w:val="ListParagraph"/>
-        <w:numPr>
-          <w:ilvl w:val="0"/>
-          <w:numId w:val="11"/>
-        </w:numPr>
-      </w:pPr>
-      <w:r>
-        <w:t>If multiple fields are invalid , all errors are returned at</w:t>
-      </w:r>
-      <w:r>
-        <w:t xml:space="preserve"> </w:t>
-      </w:r>
-      <w:r>
-        <w:t>once .</w:t>
-      </w:r>
-    </w:p>
-    <w:p>
-      <w:pPr>
-        <w:pStyle w:val="ListParagraph"/>
-        <w:numPr>
-          <w:ilvl w:val="0"/>
-          <w:numId w:val="11"/>
-        </w:numPr>
-      </w:pPr>
-      <w:r>
-        <w:t>if " email " is empty it will not be validated against the</w:t>
-      </w:r>
-      <w:r>
-        <w:t xml:space="preserve"> </w:t>
-      </w:r>
-      <w:r>
-        <w:t xml:space="preserve">regex and only show the error message for being blank </w:t>
-      </w:r>
-      <w:r>
-        <w:cr/>
-      </w:r>
-    </w:p>
-    <w:p>
-      <w:pPr>
-        <w:pStyle w:val="ListParagraph"/>
-        <w:ind w:left="1440"/>
-      </w:pPr>
-    </w:p>
-    <w:p>
-      <w:r>
-        <w:t>Example Calls &amp; Expected Outputs</w:t>
-      </w:r>
-    </w:p>
-    <w:p>
-      <w:pPr>
-        <w:pStyle w:val="ListParagraph"/>
-        <w:ind w:left="1080"/>
-      </w:pPr>
-      <w:r>
-        <w:t xml:space="preserve">1. </w:t>
-      </w:r>
-      <w:r>
-        <w:t xml:space="preserve">Normal </w:t>
-      </w:r>
-      <w:r>
-        <w:t xml:space="preserve">Functionality </w:t>
-      </w:r>
-      <w:r>
-        <w:cr/>
-      </w:r>
-      <w:r>
-        <w:t>validate_form("Alexa",</w:t>
-      </w:r>
-      <w:r>
-        <w:t>”John,</w:t>
-      </w:r>
-      <w:r>
-        <w:t>"abc@gmail.com","Question","Hallo!",True)</w:t>
-      </w:r>
-    </w:p>
-    <w:p>
-      <w:pPr>
-        <w:pStyle w:val="ListParagraph"/>
-        <w:ind w:left="1080" w:right="-563"/>
-      </w:pPr>
-      <w:r>
-        <w:t xml:space="preserve"># =&gt; </w:t>
-      </w:r>
-      <w:r>
-        <w:t>Form is valid. Details are :('Alexa'</w:t>
-      </w:r>
-      <w:r>
-        <w:t>,’</w:t>
-      </w:r>
-      <w:r>
-        <w:t>John,</w:t>
-      </w:r>
-      <w:r>
-        <w:t>’</w:t>
-      </w:r>
-      <w:r>
-        <w:t>,'abc@gmail.com','Question','Hallo!',True)</w:t>
-      </w:r>
-    </w:p>
-    <w:p>
-      <w:pPr>
-        <w:pStyle w:val="ListParagraph"/>
-        <w:ind w:left="1080"/>
-      </w:pPr>
-      <w:r>
-        <w:t xml:space="preserve">2. </w:t>
-      </w:r>
-      <w:r>
-        <w:t>Rejecting</w:t>
-      </w:r>
-      <w:r>
-        <w:t xml:space="preserve"> Privacy Policy</w:t>
-      </w:r>
-    </w:p>
-    <w:p>
-      <w:pPr>
-        <w:pStyle w:val="ListParagraph"/>
-        <w:ind w:left="1080"/>
-      </w:pPr>
-      <w:r>
-        <w:lastRenderedPageBreak/>
-        <w:t>validate_form("Alex","abc@gmail.net","Question","Hallo!",False)</w:t>
-      </w:r>
-    </w:p>
-    <w:p>
-      <w:pPr>
-        <w:pStyle w:val="ListParagraph"/>
-        <w:ind w:left="1080"/>
-      </w:pPr>
-      <w:r>
-        <w:t>#=&gt;</w:t>
-      </w:r>
-      <w:r>
-        <w:t xml:space="preserve"> "Please confirm the privacy policy"</w:t>
-      </w:r>
-    </w:p>
-    <w:p>
-      <w:pPr>
-        <w:pStyle w:val="ListParagraph"/>
-        <w:ind w:left="1080"/>
-      </w:pPr>
-      <w:r>
-        <w:t>3. Empty body</w:t>
-      </w:r>
-    </w:p>
-    <w:p>
-      <w:pPr>
-        <w:pStyle w:val="ListParagraph"/>
-        <w:ind w:left="1080"/>
-      </w:pPr>
-      <w:r>
-        <w:t>assertEqual(validate_form("","","","","")</w:t>
-      </w:r>
-      <w:r>
-        <w:t xml:space="preserve"> </w:t>
-      </w:r>
-    </w:p>
-    <w:p>
-      <w:pPr>
-        <w:pStyle w:val="ListParagraph"/>
-        <w:ind w:left="1080"/>
-      </w:pPr>
-      <w:r>
-        <w:t>#=&gt;</w:t>
-      </w:r>
-      <w:r>
-        <w:t>"Please fill all the fields and try again")</w:t>
-      </w:r>
-    </w:p>
-    <w:p>
-      <w:pPr>
-        <w:pStyle w:val="ListParagraph"/>
-        <w:ind w:left="1080"/>
+      <w:pPr>
+        <w:tabs>
+          <w:tab w:val="left" w:pos="3909"/>
+        </w:tabs>
+      </w:pPr>
+      <w:r>
+        <w:tab/>
+      </w:r>
+    </w:p>
+    <w:p>
+      <w:pPr>
+        <w:tabs>
+          <w:tab w:val="left" w:pos="3909"/>
+        </w:tabs>
       </w:pPr>
     </w:p>
     <w:p>
@@ -3417,7 +3556,13 @@
         </w:numPr>
       </w:pPr>
       <w:r>
-        <w:t>password is required and must not be nil or missing .</w:t>
+        <w:t xml:space="preserve">password is required and must not be </w:t>
+      </w:r>
+      <w:r>
+        <w:t>None</w:t>
+      </w:r>
+      <w:r>
+        <w:t xml:space="preserve"> or missing .</w:t>
       </w:r>
     </w:p>
     <w:p>
@@ -4030,7 +4175,13 @@
         </w:numPr>
       </w:pPr>
       <w:r>
-        <w:t>Assumes that each product map returned includes a non - nil ,</w:t>
+        <w:t xml:space="preserve">Assumes that each product map returned includes a non - </w:t>
+      </w:r>
+      <w:r>
+        <w:t>None</w:t>
+      </w:r>
+      <w:r>
+        <w:t xml:space="preserve"> ,</w:t>
       </w:r>
       <w:r>
         <w:t xml:space="preserve"> </w:t>

</xml_diff>

<commit_message>
task6 deepseek generation done
</commit_message>
<xml_diff>
--- a/Prompts (2).docx
+++ b/Prompts (2).docx
@@ -3012,8 +3012,6 @@
       <w:r>
         <w:t xml:space="preserve"> and should verify it only after trimming whitespaces</w:t>
       </w:r>
-      <w:bookmarkStart w:id="0" w:name="_GoBack"/>
-      <w:bookmarkEnd w:id="0"/>
       <w:r>
         <w:t>.</w:t>
       </w:r>
@@ -3491,7 +3489,28 @@
         </w:numPr>
       </w:pPr>
       <w:r>
-        <w:t>Returns True</w:t>
+        <w:t xml:space="preserve"> Return </w:t>
+      </w:r>
+      <w:r>
+        <w:t>“</w:t>
+      </w:r>
+      <w:r>
+        <w:t>The password is valid</w:t>
+      </w:r>
+      <w:r>
+        <w:t>”</w:t>
+      </w:r>
+    </w:p>
+    <w:p>
+      <w:pPr>
+        <w:pStyle w:val="ListParagraph"/>
+        <w:numPr>
+          <w:ilvl w:val="0"/>
+          <w:numId w:val="9"/>
+        </w:numPr>
+      </w:pPr>
+      <w:r>
+        <w:t>Failure:</w:t>
       </w:r>
     </w:p>
     <w:p>
@@ -3503,43 +3522,67 @@
         </w:numPr>
       </w:pPr>
       <w:r>
-        <w:t>All validations passed</w:t>
-      </w:r>
-    </w:p>
-    <w:p>
-      <w:pPr>
-        <w:pStyle w:val="ListParagraph"/>
-        <w:numPr>
-          <w:ilvl w:val="0"/>
+        <w:t>Should return one or more of the following error messages in a list:</w:t>
+      </w:r>
+    </w:p>
+    <w:p>
+      <w:pPr>
+        <w:pStyle w:val="ListParagraph"/>
+        <w:numPr>
+          <w:ilvl w:val="2"/>
           <w:numId w:val="9"/>
         </w:numPr>
       </w:pPr>
       <w:r>
-        <w:t>Failure:</w:t>
-      </w:r>
-    </w:p>
-    <w:p>
-      <w:pPr>
-        <w:pStyle w:val="ListParagraph"/>
-        <w:numPr>
-          <w:ilvl w:val="1"/>
+        <w:t>Please fill the password</w:t>
+      </w:r>
+    </w:p>
+    <w:p>
+      <w:pPr>
+        <w:pStyle w:val="ListParagraph"/>
+        <w:numPr>
+          <w:ilvl w:val="2"/>
           <w:numId w:val="9"/>
         </w:numPr>
       </w:pPr>
       <w:r>
-        <w:t>Return False</w:t>
-      </w:r>
-    </w:p>
-    <w:p>
-      <w:pPr>
-        <w:pStyle w:val="ListParagraph"/>
-        <w:numPr>
-          <w:ilvl w:val="1"/>
+        <w:t>Length must be between 12 and 72 characters</w:t>
+      </w:r>
+    </w:p>
+    <w:p>
+      <w:pPr>
+        <w:pStyle w:val="ListParagraph"/>
+        <w:numPr>
+          <w:ilvl w:val="2"/>
           <w:numId w:val="9"/>
         </w:numPr>
       </w:pPr>
       <w:r>
-        <w:t>Mention to follow all the rules accordingly</w:t>
+        <w:t>Password must contain a lowercase letter</w:t>
+      </w:r>
+    </w:p>
+    <w:p>
+      <w:pPr>
+        <w:pStyle w:val="ListParagraph"/>
+        <w:numPr>
+          <w:ilvl w:val="2"/>
+          <w:numId w:val="9"/>
+        </w:numPr>
+      </w:pPr>
+      <w:r>
+        <w:t>Password must contain an uppercase letter</w:t>
+      </w:r>
+    </w:p>
+    <w:p>
+      <w:pPr>
+        <w:pStyle w:val="ListParagraph"/>
+        <w:numPr>
+          <w:ilvl w:val="2"/>
+          <w:numId w:val="9"/>
+        </w:numPr>
+      </w:pPr>
+      <w:r>
+        <w:t>Password must contain a special character or a number</w:t>
       </w:r>
     </w:p>
     <w:p>
@@ -3634,7 +3677,13 @@
         </w:numPr>
       </w:pPr>
       <w:r>
-        <w:t>one digit or punctuation character ([!? @#$ %^&amp;* _0 -9])</w:t>
+        <w:t>one digit or punctuation character ([!? @#$ %^&amp;* _</w:t>
+      </w:r>
+      <w:r>
+        <w:t xml:space="preserve"> </w:t>
+      </w:r>
+      <w:r>
+        <w:t>0 -9])</w:t>
       </w:r>
     </w:p>
     <w:p>
@@ -3646,100 +3695,121 @@
         </w:numPr>
       </w:pPr>
       <w:r>
+        <w:lastRenderedPageBreak/>
         <w:t>The function does not modify the password value , only validates it .</w:t>
       </w:r>
       <w:r>
         <w:cr/>
       </w:r>
-      <w:r>
-        <w:cr/>
-      </w:r>
-      <w:r>
-        <w:cr/>
-      </w:r>
-      <w:r>
-        <w:lastRenderedPageBreak/>
-        <w:cr/>
+    </w:p>
+    <w:p>
+      <w:pPr>
+        <w:pStyle w:val="ListParagraph"/>
+        <w:numPr>
+          <w:ilvl w:val="0"/>
+          <w:numId w:val="10"/>
+        </w:numPr>
+      </w:pPr>
+      <w:r>
+        <w:t>Error messages are collected as a list and multiple error messages are appended into that list.</w:t>
+      </w:r>
+    </w:p>
+    <w:p>
+      <w:r>
+        <w:t>Known Edge cases</w:t>
+      </w:r>
+    </w:p>
+    <w:p>
+      <w:pPr>
+        <w:pStyle w:val="ListParagraph"/>
+        <w:numPr>
+          <w:ilvl w:val="0"/>
+          <w:numId w:val="11"/>
+        </w:numPr>
+      </w:pPr>
+      <w:r>
+        <w:t xml:space="preserve">If : password is missing , </w:t>
+      </w:r>
+      <w:r>
+        <w:t xml:space="preserve">It should </w:t>
+      </w:r>
+      <w:r>
+        <w:t>append</w:t>
+      </w:r>
+      <w:r>
+        <w:t xml:space="preserve"> “Please fill the password”</w:t>
+      </w:r>
+      <w:r>
+        <w:t xml:space="preserve"> in errors list</w:t>
+      </w:r>
+    </w:p>
+    <w:p>
+      <w:pPr>
+        <w:pStyle w:val="ListParagraph"/>
+        <w:numPr>
+          <w:ilvl w:val="0"/>
+          <w:numId w:val="11"/>
+        </w:numPr>
+      </w:pPr>
+      <w:r>
+        <w:t xml:space="preserve">If : password is shorter than </w:t>
+      </w:r>
+      <w:r>
+        <w:t>12</w:t>
+      </w:r>
+      <w:r>
+        <w:t xml:space="preserve"> or longer than </w:t>
+      </w:r>
+      <w:r>
+        <w:t xml:space="preserve">72 </w:t>
+      </w:r>
+      <w:r>
+        <w:t xml:space="preserve">characters , it should </w:t>
+      </w:r>
+      <w:r>
+        <w:t xml:space="preserve">append </w:t>
+      </w:r>
+      <w:r>
+        <w:t xml:space="preserve">message “ </w:t>
+      </w:r>
+      <w:r>
+        <w:t>Length must be between 12 and 72 characters</w:t>
+      </w:r>
+      <w:r>
+        <w:t>”</w:t>
       </w:r>
       <w:r>
         <w:t xml:space="preserve"> </w:t>
       </w:r>
       <w:r>
+        <w:t>in errors list</w:t>
+      </w:r>
+    </w:p>
+    <w:p>
+      <w:pPr>
+        <w:pStyle w:val="ListParagraph"/>
+        <w:numPr>
+          <w:ilvl w:val="0"/>
+          <w:numId w:val="11"/>
+        </w:numPr>
+      </w:pPr>
+      <w:r>
+        <w:t xml:space="preserve">If </w:t>
+      </w:r>
+      <w:r>
+        <w:t xml:space="preserve">: </w:t>
+      </w:r>
+      <w:r>
+        <w:t>password lacks one of the required character types ,</w:t>
+      </w:r>
+      <w:r>
         <w:t xml:space="preserve"> </w:t>
       </w:r>
-    </w:p>
-    <w:p>
-      <w:r>
-        <w:t>Known Edge cases</w:t>
-      </w:r>
-    </w:p>
-    <w:p>
-      <w:pPr>
-        <w:pStyle w:val="ListParagraph"/>
-        <w:numPr>
-          <w:ilvl w:val="0"/>
-          <w:numId w:val="11"/>
-        </w:numPr>
-      </w:pPr>
-      <w:r>
-        <w:t xml:space="preserve">If : password is missing , </w:t>
-      </w:r>
-      <w:r>
-        <w:t>It should return “Please fill the password”</w:t>
-      </w:r>
-    </w:p>
-    <w:p>
-      <w:pPr>
-        <w:pStyle w:val="ListParagraph"/>
-        <w:numPr>
-          <w:ilvl w:val="0"/>
-          <w:numId w:val="11"/>
-        </w:numPr>
-      </w:pPr>
-      <w:r>
-        <w:t xml:space="preserve">If : password is shorter than </w:t>
-      </w:r>
-      <w:r>
-        <w:t>12</w:t>
-      </w:r>
-      <w:r>
-        <w:t xml:space="preserve"> or longer than </w:t>
-      </w:r>
-      <w:r>
-        <w:t xml:space="preserve">72 </w:t>
-      </w:r>
-      <w:r>
-        <w:t xml:space="preserve">characters , it should return  message “ </w:t>
-      </w:r>
-      <w:r>
-        <w:t>Length must be between 12 and 72 characters</w:t>
-      </w:r>
-      <w:r>
-        <w:t>”</w:t>
-      </w:r>
-    </w:p>
-    <w:p>
-      <w:pPr>
-        <w:pStyle w:val="ListParagraph"/>
-        <w:numPr>
-          <w:ilvl w:val="0"/>
-          <w:numId w:val="11"/>
-        </w:numPr>
-      </w:pPr>
-      <w:r>
-        <w:t xml:space="preserve">If </w:t>
-      </w:r>
-      <w:r>
-        <w:t xml:space="preserve">: </w:t>
-      </w:r>
-      <w:r>
-        <w:t>password lacks one of the required character types ,</w:t>
-      </w:r>
-      <w:r>
-        <w:t xml:space="preserve"> </w:t>
-      </w:r>
-      <w:r>
-        <w:t>appropriate message is added</w:t>
+      <w:r>
+        <w:t xml:space="preserve">appropriate message is </w:t>
+      </w:r>
+      <w:r>
+        <w:t>appended into the errors list:</w:t>
       </w:r>
     </w:p>
     <w:p>
@@ -3813,7 +3883,7 @@
         <w:cr/>
       </w:r>
       <w:r>
-        <w:t xml:space="preserve"> (IsValidPassword(""))</w:t>
+        <w:t xml:space="preserve"> IsValidPassword("")</w:t>
       </w:r>
     </w:p>
     <w:p>
@@ -3825,8 +3895,14 @@
         <w:t xml:space="preserve"># =&gt; </w:t>
       </w:r>
       <w:r>
+        <w:t>[“</w:t>
+      </w:r>
+      <w:r>
         <w:t>Please fill the password</w:t>
       </w:r>
+      <w:r>
+        <w:t>”]</w:t>
+      </w:r>
     </w:p>
     <w:p>
       <w:pPr>
@@ -3858,15 +3934,6 @@
         <w:ind w:left="1080"/>
       </w:pPr>
       <w:r>
-        <w:t>Returns False</w:t>
-      </w:r>
-    </w:p>
-    <w:p>
-      <w:pPr>
-        <w:pStyle w:val="ListParagraph"/>
-        <w:ind w:left="1080"/>
-      </w:pPr>
-      <w:r>
         <w:t xml:space="preserve">3. </w:t>
       </w:r>
       <w:r>
@@ -3881,8 +3948,16 @@
       <w:r>
         <w:t xml:space="preserve"># =&gt; </w:t>
       </w:r>
+      <w:bookmarkStart w:id="0" w:name="_GoBack"/>
+      <w:bookmarkEnd w:id="0"/>
+      <w:r>
+        <w:t>“</w:t>
+      </w:r>
       <w:r>
         <w:t>The password is valid</w:t>
+      </w:r>
+      <w:r>
+        <w:t>”</w:t>
       </w:r>
     </w:p>
     <w:p>
@@ -6871,7 +6946,7 @@
         <w:rFonts w:ascii="Courier New" w:hAnsi="Courier New" w:cs="Courier New" w:hint="default"/>
       </w:rPr>
     </w:lvl>
-    <w:lvl w:ilvl="2" w:tplc="04090005" w:tentative="1">
+    <w:lvl w:ilvl="2" w:tplc="04090005">
       <w:start w:val="1"/>
       <w:numFmt w:val="bullet"/>
       <w:lvlText w:val=""/>

</xml_diff>

<commit_message>
task1 deepseek implementation generated
</commit_message>
<xml_diff>
--- a/Prompts (2).docx
+++ b/Prompts (2).docx
@@ -146,7 +146,13 @@
         <w:ind w:left="1440"/>
       </w:pPr>
       <w:r>
-        <w:t>available product dataset .</w:t>
+        <w:t xml:space="preserve">available product dataset </w:t>
+      </w:r>
+      <w:r>
+        <w:t xml:space="preserve"> in list format</w:t>
+      </w:r>
+      <w:r>
+        <w:t>.</w:t>
       </w:r>
     </w:p>
     <w:p>
@@ -161,7 +167,7 @@
         <w:t xml:space="preserve">Eliminates duplicates and removes any </w:t>
       </w:r>
       <w:r>
-        <w:t>Null/None</w:t>
+        <w:t>None</w:t>
       </w:r>
       <w:r>
         <w:t xml:space="preserve"> or empty string values</w:t>
@@ -224,33 +230,6 @@
       </w:r>
     </w:p>
     <w:p>
-      <w:pPr>
-        <w:pStyle w:val="ListParagraph"/>
-        <w:numPr>
-          <w:ilvl w:val="0"/>
-          <w:numId w:val="3"/>
-        </w:numPr>
-      </w:pPr>
-      <w:r>
-        <w:t>Dependency:</w:t>
-      </w:r>
-    </w:p>
-    <w:p>
-      <w:pPr>
-        <w:pStyle w:val="ListParagraph"/>
-        <w:numPr>
-          <w:ilvl w:val="1"/>
-          <w:numId w:val="3"/>
-        </w:numPr>
-      </w:pPr>
-      <w:r>
-        <w:t xml:space="preserve">Calls get_unique function , expected to return a list of </w:t>
-      </w:r>
-      <w:r>
-        <w:t>unique brands</w:t>
-      </w:r>
-    </w:p>
-    <w:p>
       <w:r>
         <w:t>Outputs</w:t>
       </w:r>
@@ -318,7 +297,13 @@
         </w:numPr>
       </w:pPr>
       <w:r>
-        <w:t>Returns an empty list `[]` if no valid brand values exist.</w:t>
+        <w:t xml:space="preserve">Returns </w:t>
+      </w:r>
+      <w:r>
+        <w:t xml:space="preserve">None </w:t>
+      </w:r>
+      <w:r>
+        <w:t>if no valid brand values exist.</w:t>
       </w:r>
     </w:p>
     <w:p>
@@ -335,7 +320,13 @@
         </w:numPr>
       </w:pPr>
       <w:r>
-        <w:t>Assumes each product list contains a brand key</w:t>
+        <w:t xml:space="preserve">Assumes each product </w:t>
+      </w:r>
+      <w:r>
+        <w:t>dictionary</w:t>
+      </w:r>
+      <w:r>
+        <w:t xml:space="preserve"> contains a brand key</w:t>
       </w:r>
     </w:p>
     <w:p>
@@ -347,7 +338,7 @@
         </w:numPr>
       </w:pPr>
       <w:r>
-        <w:t>Brand values must be strings ; Null/None and empty strings are filtered out</w:t>
+        <w:t>Brand values must be strings ; None and empty strings are filtered out</w:t>
       </w:r>
     </w:p>
     <w:p>
@@ -387,18 +378,8 @@
       </w:r>
     </w:p>
     <w:p>
-      <w:pPr>
-        <w:pStyle w:val="ListParagraph"/>
-        <w:numPr>
-          <w:ilvl w:val="0"/>
-          <w:numId w:val="10"/>
-        </w:numPr>
-      </w:pPr>
-      <w:r>
-        <w:t>Prioritize dictionaries , lists over sets.</w:t>
-      </w:r>
-    </w:p>
-    <w:p>
+      <w:bookmarkStart w:id="0" w:name="_GoBack"/>
+      <w:bookmarkEnd w:id="0"/>
       <w:r>
         <w:t>Known Edge cases</w:t>
       </w:r>
@@ -418,7 +399,7 @@
         <w:t>None</w:t>
       </w:r>
       <w:r>
-        <w:t xml:space="preserve"> or "" , the result is []</w:t>
+        <w:t xml:space="preserve"> or "" , the result is None</w:t>
       </w:r>
     </w:p>
     <w:p>
@@ -430,19 +411,23 @@
         </w:numPr>
       </w:pPr>
       <w:r>
+        <w:t>If get_all_products /0 re</w:t>
+      </w:r>
+      <w:r>
+        <w:t>turns [] , the result is also None</w:t>
+      </w:r>
+    </w:p>
+    <w:p/>
+    <w:p>
+      <w:pPr>
+        <w:pStyle w:val="ListParagraph"/>
+        <w:numPr>
+          <w:ilvl w:val="0"/>
+          <w:numId w:val="11"/>
+        </w:numPr>
+      </w:pPr>
+      <w:r>
         <w:lastRenderedPageBreak/>
-        <w:t>If get_all_products /0 returns [] , the result is also []</w:t>
-      </w:r>
-    </w:p>
-    <w:p>
-      <w:pPr>
-        <w:pStyle w:val="ListParagraph"/>
-        <w:numPr>
-          <w:ilvl w:val="0"/>
-          <w:numId w:val="11"/>
-        </w:numPr>
-      </w:pPr>
-      <w:r>
         <w:t>If the same brand appears in lower and upper case , it is</w:t>
       </w:r>
       <w:r>
@@ -481,7 +466,34 @@
         <w:ind w:left="1080"/>
       </w:pPr>
       <w:r>
-        <w:t xml:space="preserve"> get_unique ([" Brandname1 ", " Brandname2 ", " Brandname3 "])</w:t>
+        <w:t xml:space="preserve"> get_unique({‘brand’:’Brandname1’},</w:t>
+      </w:r>
+      <w:r>
+        <w:t>{‘brand’:’</w:t>
+      </w:r>
+      <w:r>
+        <w:t>Brandname2</w:t>
+      </w:r>
+      <w:r>
+        <w:t>’},{‘brand’:’</w:t>
+      </w:r>
+      <w:r>
+        <w:t>Brandname3</w:t>
+      </w:r>
+      <w:r>
+        <w:t>’}</w:t>
+      </w:r>
+      <w:r>
+        <w:t>)</w:t>
+      </w:r>
+    </w:p>
+    <w:p>
+      <w:pPr>
+        <w:pStyle w:val="ListParagraph"/>
+        <w:ind w:left="1080"/>
+      </w:pPr>
+      <w:r>
+        <w:t>[‘Brandname1’,’Brandname2’,’Brandname3’]</w:t>
       </w:r>
     </w:p>
     <w:p>
@@ -510,7 +522,7 @@
     </w:p>
     <w:p>
       <w:r>
-        <w:t xml:space="preserve">                   #=&gt; []</w:t>
+        <w:t xml:space="preserve">                   #=&gt; None</w:t>
       </w:r>
     </w:p>
     <w:p>
@@ -3779,10 +3791,7 @@
         <w:t>”</w:t>
       </w:r>
       <w:r>
-        <w:t xml:space="preserve"> </w:t>
-      </w:r>
-      <w:r>
-        <w:t>in errors list</w:t>
+        <w:t xml:space="preserve"> in errors list</w:t>
       </w:r>
     </w:p>
     <w:p>
@@ -3948,8 +3957,6 @@
       <w:r>
         <w:t xml:space="preserve"># =&gt; </w:t>
       </w:r>
-      <w:bookmarkStart w:id="0" w:name="_GoBack"/>
-      <w:bookmarkEnd w:id="0"/>
       <w:r>
         <w:t>“</w:t>
       </w:r>

</xml_diff>

<commit_message>
deepseek model implementation completed
</commit_message>
<xml_diff>
--- a/Prompts (2).docx
+++ b/Prompts (2).docx
@@ -38,7 +38,26 @@
     </w:p>
     <w:p>
       <w:r>
-        <w:t>- Do not add any text, explanation, or markdown outside the code block. Return only raw Python code. -Do not add inline comments inside the code.</w:t>
+        <w:t>- Do not add any text, explanation, or</w:t>
+      </w:r>
+      <w:r>
+        <w:t xml:space="preserve"> code fences</w:t>
+      </w:r>
+      <w:r>
+        <w:t>. Return only raw Python code.</w:t>
+      </w:r>
+    </w:p>
+    <w:p>
+      <w:r>
+        <w:t>-Return plain raw Python only</w:t>
+      </w:r>
+    </w:p>
+    <w:p>
+      <w:r>
+        <w:t xml:space="preserve">- Entire response should be executable python code only. Do not include any comments or </w:t>
+      </w:r>
+      <w:r>
+        <w:t>explanations</w:t>
       </w:r>
     </w:p>
     <w:p>
@@ -100,7 +119,6 @@
     <w:p/>
     <w:p>
       <w:r>
-        <w:lastRenderedPageBreak/>
         <w:t xml:space="preserve"> Module Name: Unique_Brands</w:t>
       </w:r>
     </w:p>
@@ -374,12 +392,34 @@
         </w:numPr>
       </w:pPr>
       <w:r>
+        <w:t>Do not use sets for deduplication.</w:t>
+      </w:r>
+    </w:p>
+    <w:p>
+      <w:pPr>
+        <w:pStyle w:val="ListParagraph"/>
+        <w:numPr>
+          <w:ilvl w:val="0"/>
+          <w:numId w:val="10"/>
+        </w:numPr>
+      </w:pPr>
+      <w:r>
+        <w:t>Use only dictionaries and/or lists.</w:t>
+      </w:r>
+    </w:p>
+    <w:p>
+      <w:pPr>
+        <w:pStyle w:val="ListParagraph"/>
+        <w:numPr>
+          <w:ilvl w:val="0"/>
+          <w:numId w:val="10"/>
+        </w:numPr>
+      </w:pPr>
+      <w:r>
         <w:t>Do not sort the final output list.</w:t>
       </w:r>
     </w:p>
     <w:p>
-      <w:bookmarkStart w:id="0" w:name="_GoBack"/>
-      <w:bookmarkEnd w:id="0"/>
       <w:r>
         <w:t>Known Edge cases</w:t>
       </w:r>
@@ -393,6 +433,7 @@
         </w:numPr>
       </w:pPr>
       <w:r>
+        <w:lastRenderedPageBreak/>
         <w:t xml:space="preserve">If all brand values are </w:t>
       </w:r>
       <w:r>
@@ -427,7 +468,6 @@
         </w:numPr>
       </w:pPr>
       <w:r>
-        <w:lastRenderedPageBreak/>
         <w:t>If the same brand appears in lower and upper case , it is</w:t>
       </w:r>
       <w:r>
@@ -466,25 +506,7 @@
         <w:ind w:left="1080"/>
       </w:pPr>
       <w:r>
-        <w:t xml:space="preserve"> get_unique({‘brand’:’Brandname1’},</w:t>
-      </w:r>
-      <w:r>
-        <w:t>{‘brand’:’</w:t>
-      </w:r>
-      <w:r>
-        <w:t>Brandname2</w:t>
-      </w:r>
-      <w:r>
-        <w:t>’},{‘brand’:’</w:t>
-      </w:r>
-      <w:r>
-        <w:t>Brandname3</w:t>
-      </w:r>
-      <w:r>
-        <w:t>’}</w:t>
-      </w:r>
-      <w:r>
-        <w:t>)</w:t>
+        <w:t xml:space="preserve"> get_unique({‘brand’:’Brandname1’},{‘brand’:’Brandname2’},{‘brand’:’Brandname3’})</w:t>
       </w:r>
     </w:p>
     <w:p>
@@ -996,6 +1018,7 @@
         </w:numPr>
       </w:pPr>
       <w:r>
+        <w:lastRenderedPageBreak/>
         <w:t>If only one product has a price , returns that price as a float</w:t>
       </w:r>
       <w:r>
@@ -1025,7 +1048,6 @@
         <w:ind w:left="1440"/>
       </w:pPr>
       <w:r>
-        <w:lastRenderedPageBreak/>
         <w:t>price_list</w:t>
       </w:r>
       <w:r>
@@ -1593,6 +1615,7 @@
         <w:ind w:firstLine="720"/>
       </w:pPr>
       <w:r>
+        <w:lastRenderedPageBreak/>
         <w:t>o</w:t>
       </w:r>
       <w:r>
@@ -1615,163 +1638,163 @@
         </w:numPr>
       </w:pPr>
       <w:r>
+        <w:t xml:space="preserve">Only products where get_min_2_attributes( data, dict_search) is not </w:t>
+      </w:r>
+      <w:r>
+        <w:t>None</w:t>
+      </w:r>
+      <w:r>
+        <w:t xml:space="preserve"> are considered .</w:t>
+      </w:r>
+    </w:p>
+    <w:p>
+      <w:pPr>
+        <w:pStyle w:val="ListParagraph"/>
+        <w:numPr>
+          <w:ilvl w:val="0"/>
+          <w:numId w:val="10"/>
+        </w:numPr>
+      </w:pPr>
+      <w:r>
+        <w:t>The attribute must be numeric ( integer or float ).</w:t>
+      </w:r>
+    </w:p>
+    <w:p>
+      <w:pPr>
+        <w:pStyle w:val="ListParagraph"/>
+        <w:numPr>
+          <w:ilvl w:val="0"/>
+          <w:numId w:val="10"/>
+        </w:numPr>
+      </w:pPr>
+      <w:r>
+        <w:t>Values must be comparable using Enum . min /1.</w:t>
+      </w:r>
+      <w:r>
+        <w:cr/>
+      </w:r>
+      <w:r>
+        <w:cr/>
+      </w:r>
+      <w:r>
+        <w:t xml:space="preserve"> </w:t>
+      </w:r>
+      <w:r>
+        <w:t xml:space="preserve">  </w:t>
+      </w:r>
+    </w:p>
+    <w:p>
+      <w:r>
+        <w:t>Known Edge cases</w:t>
+      </w:r>
+    </w:p>
+    <w:p>
+      <w:pPr>
+        <w:pStyle w:val="ListParagraph"/>
+        <w:numPr>
+          <w:ilvl w:val="0"/>
+          <w:numId w:val="11"/>
+        </w:numPr>
+      </w:pPr>
+      <w:r>
+        <w:t>If all values for the given attribute are None , the function returns None.</w:t>
+      </w:r>
+    </w:p>
+    <w:p>
+      <w:pPr>
+        <w:pStyle w:val="ListParagraph"/>
+        <w:numPr>
+          <w:ilvl w:val="0"/>
+          <w:numId w:val="11"/>
+        </w:numPr>
+      </w:pPr>
+      <w:r>
+        <w:t xml:space="preserve">If products is an empty list , the result is also </w:t>
+      </w:r>
+      <w:r>
+        <w:t>None</w:t>
+      </w:r>
+      <w:r>
+        <w:t xml:space="preserve"> .</w:t>
+      </w:r>
+      <w:r>
+        <w:cr/>
+      </w:r>
+    </w:p>
+    <w:p>
+      <w:pPr>
+        <w:pStyle w:val="ListParagraph"/>
+        <w:ind w:left="1440"/>
+      </w:pPr>
+    </w:p>
+    <w:p>
+      <w:r>
+        <w:t>Example Calls &amp; Expected Outputs</w:t>
+      </w:r>
+    </w:p>
+    <w:p/>
+    <w:p>
+      <w:r>
+        <w:t xml:space="preserve"> </w:t>
+      </w:r>
+      <w:r>
+        <w:t>get_min_2_attributes(data = [</w:t>
+      </w:r>
+    </w:p>
+    <w:p>
+      <w:r>
+        <w:t>    {"price": 49.99, "battery_life": 4.0},</w:t>
+      </w:r>
+    </w:p>
+    <w:p>
+      <w:r>
+        <w:t>    {"price": 29.99, "battery_life": 3.5},</w:t>
+      </w:r>
+    </w:p>
+    <w:p>
+      <w:r>
+        <w:t>    {"price": None, "battery_life": 5.0},  </w:t>
+      </w:r>
+    </w:p>
+    <w:p>
+      <w:r>
+        <w:t xml:space="preserve">    {"battery_life": 2.0}                   </w:t>
+      </w:r>
+    </w:p>
+    <w:p>
+      <w:r>
+        <w:t>], "price")</w:t>
+      </w:r>
+    </w:p>
+    <w:p>
+      <w:r>
+        <w:t># =&gt; 29.99</w:t>
+      </w:r>
+    </w:p>
+    <w:p/>
+    <w:p>
+      <w:r>
+        <w:t>get_min_2_attributes(data = [</w:t>
+      </w:r>
+    </w:p>
+    <w:p>
+      <w:r>
+        <w:t>    {"price": 49.99, "battery_life": 4.0},</w:t>
+      </w:r>
+    </w:p>
+    <w:p>
+      <w:r>
+        <w:t>    {"price": 29.99, "battery_life": 3.5},</w:t>
+      </w:r>
+    </w:p>
+    <w:p>
+      <w:r>
+        <w:t>    {"price": None, "battery_life": 5.0},  </w:t>
+      </w:r>
+    </w:p>
+    <w:p>
+      <w:r>
         <w:lastRenderedPageBreak/>
-        <w:t xml:space="preserve">Only products where get_min_2_attributes( data, dict_search) is not </w:t>
-      </w:r>
-      <w:r>
-        <w:t>None</w:t>
-      </w:r>
-      <w:r>
-        <w:t xml:space="preserve"> are considered .</w:t>
-      </w:r>
-    </w:p>
-    <w:p>
-      <w:pPr>
-        <w:pStyle w:val="ListParagraph"/>
-        <w:numPr>
-          <w:ilvl w:val="0"/>
-          <w:numId w:val="10"/>
-        </w:numPr>
-      </w:pPr>
-      <w:r>
-        <w:t>The attribute must be numeric ( integer or float ).</w:t>
-      </w:r>
-    </w:p>
-    <w:p>
-      <w:pPr>
-        <w:pStyle w:val="ListParagraph"/>
-        <w:numPr>
-          <w:ilvl w:val="0"/>
-          <w:numId w:val="10"/>
-        </w:numPr>
-      </w:pPr>
-      <w:r>
-        <w:t>Values must be comparable using Enum . min /1.</w:t>
-      </w:r>
-      <w:r>
-        <w:cr/>
-      </w:r>
-      <w:r>
-        <w:cr/>
-      </w:r>
-      <w:r>
-        <w:t xml:space="preserve"> </w:t>
-      </w:r>
-      <w:r>
-        <w:t xml:space="preserve">  </w:t>
-      </w:r>
-    </w:p>
-    <w:p>
-      <w:r>
-        <w:t>Known Edge cases</w:t>
-      </w:r>
-    </w:p>
-    <w:p>
-      <w:pPr>
-        <w:pStyle w:val="ListParagraph"/>
-        <w:numPr>
-          <w:ilvl w:val="0"/>
-          <w:numId w:val="11"/>
-        </w:numPr>
-      </w:pPr>
-      <w:r>
-        <w:t>If all values for the given attribute are None , the function returns None.</w:t>
-      </w:r>
-    </w:p>
-    <w:p>
-      <w:pPr>
-        <w:pStyle w:val="ListParagraph"/>
-        <w:numPr>
-          <w:ilvl w:val="0"/>
-          <w:numId w:val="11"/>
-        </w:numPr>
-      </w:pPr>
-      <w:r>
-        <w:t xml:space="preserve">If products is an empty list , the result is also </w:t>
-      </w:r>
-      <w:r>
-        <w:t>None</w:t>
-      </w:r>
-      <w:r>
-        <w:t xml:space="preserve"> .</w:t>
-      </w:r>
-      <w:r>
-        <w:cr/>
-      </w:r>
-    </w:p>
-    <w:p>
-      <w:pPr>
-        <w:pStyle w:val="ListParagraph"/>
-        <w:ind w:left="1440"/>
-      </w:pPr>
-    </w:p>
-    <w:p>
-      <w:r>
-        <w:t>Example Calls &amp; Expected Outputs</w:t>
-      </w:r>
-    </w:p>
-    <w:p/>
-    <w:p>
-      <w:r>
-        <w:t xml:space="preserve"> </w:t>
-      </w:r>
-      <w:r>
-        <w:t>get_min_2_attributes(data = [</w:t>
-      </w:r>
-    </w:p>
-    <w:p>
-      <w:r>
-        <w:t>    {"price": 49.99, "battery_life": 4.0},</w:t>
-      </w:r>
-    </w:p>
-    <w:p>
-      <w:r>
-        <w:t>    {"price": 29.99, "battery_life": 3.5},</w:t>
-      </w:r>
-    </w:p>
-    <w:p>
-      <w:r>
-        <w:t>    {"price": None, "battery_life": 5.0},  </w:t>
-      </w:r>
-    </w:p>
-    <w:p>
-      <w:r>
-        <w:t xml:space="preserve">    {"battery_life": 2.0}                   </w:t>
-      </w:r>
-    </w:p>
-    <w:p>
-      <w:r>
-        <w:t>], "price")</w:t>
-      </w:r>
-    </w:p>
-    <w:p>
-      <w:r>
-        <w:t># =&gt; 29.99</w:t>
-      </w:r>
-    </w:p>
-    <w:p/>
-    <w:p>
-      <w:r>
-        <w:t>get_min_2_attributes(data = [</w:t>
-      </w:r>
-    </w:p>
-    <w:p>
-      <w:r>
-        <w:t>    {"price": 49.99, "battery_life": 4.0},</w:t>
-      </w:r>
-    </w:p>
-    <w:p>
-      <w:r>
-        <w:t>    {"price": 29.99, "battery_life": 3.5},</w:t>
-      </w:r>
-    </w:p>
-    <w:p>
-      <w:r>
-        <w:t>    {"price": None, "battery_life": 5.0},  </w:t>
-      </w:r>
-    </w:p>
-    <w:p>
-      <w:r>
         <w:t xml:space="preserve">    {"battery_life": 2.0}                   </w:t>
       </w:r>
     </w:p>
@@ -1984,7 +2007,6 @@
     </w:p>
     <w:p>
       <w:r>
-        <w:lastRenderedPageBreak/>
         <w:t>Module Name: get_</w:t>
       </w:r>
       <w:r>
@@ -2244,6 +2266,7 @@
         <w:ind w:left="1080"/>
       </w:pPr>
       <w:r>
+        <w:lastRenderedPageBreak/>
         <w:t xml:space="preserve">1. </w:t>
       </w:r>
       <w:r>
@@ -2323,7 +2346,6 @@
         <w:ind w:left="1080"/>
       </w:pPr>
       <w:r>
-        <w:lastRenderedPageBreak/>
         <w:t>get_</w:t>
       </w:r>
       <w:r>
@@ -2540,7 +2562,6 @@
     </w:p>
     <w:p>
       <w:r>
-        <w:lastRenderedPageBreak/>
         <w:t>Module Name: Form Validation</w:t>
       </w:r>
     </w:p>
@@ -2902,6 +2923,7 @@
         </w:numPr>
       </w:pPr>
       <w:r>
+        <w:lastRenderedPageBreak/>
         <w:t>Please T</w:t>
       </w:r>
       <w:r>
@@ -3254,6 +3276,7 @@
         <w:ind w:left="1080" w:right="-563"/>
       </w:pPr>
       <w:r>
+        <w:lastRenderedPageBreak/>
         <w:t xml:space="preserve">2. </w:t>
       </w:r>
       <w:r>
@@ -3344,7 +3367,6 @@
         <w:ind w:left="1080"/>
       </w:pPr>
       <w:r>
-        <w:lastRenderedPageBreak/>
         <w:t>#=&gt;</w:t>
       </w:r>
       <w:r>
@@ -3629,6 +3651,7 @@
         </w:numPr>
       </w:pPr>
       <w:r>
+        <w:lastRenderedPageBreak/>
         <w:t xml:space="preserve">password must be a string between </w:t>
       </w:r>
       <w:r>
@@ -3707,7 +3730,6 @@
         </w:numPr>
       </w:pPr>
       <w:r>
-        <w:lastRenderedPageBreak/>
         <w:t>The function does not modify the password value , only validates it .</w:t>
       </w:r>
       <w:r>
@@ -4122,7 +4144,22 @@
         </w:numPr>
       </w:pPr>
       <w:r>
-        <w:t>Fetches the full product dataset on mount and renders the title of each product inside an HTML list .</w:t>
+        <w:t>Takes</w:t>
+      </w:r>
+      <w:r>
+        <w:t xml:space="preserve"> </w:t>
+      </w:r>
+      <w:r>
+        <w:t xml:space="preserve">a </w:t>
+      </w:r>
+      <w:r>
+        <w:t xml:space="preserve">product </w:t>
+      </w:r>
+      <w:r>
+        <w:t xml:space="preserve">list as input from the function argument </w:t>
+      </w:r>
+      <w:r>
+        <w:t>and renders the title of each product inside an HTML list .</w:t>
       </w:r>
     </w:p>
     <w:p>
@@ -4143,10 +4180,10 @@
         <w:ind w:left="1440"/>
       </w:pPr>
       <w:r>
-        <w:t>raw product data for display or filtering purposes .</w:t>
-      </w:r>
-      <w:r>
-        <w:cr/>
+        <w:t xml:space="preserve">raw product data for </w:t>
+      </w:r>
+      <w:r>
+        <w:t>display or filtering purposes .</w:t>
       </w:r>
     </w:p>
     <w:p>
@@ -4178,40 +4215,10 @@
         </w:numPr>
       </w:pPr>
       <w:r>
-        <w:t xml:space="preserve"> shopping_list: Takes in a list of products </w:t>
-      </w:r>
-    </w:p>
-    <w:p>
-      <w:pPr>
-        <w:pStyle w:val="ListParagraph"/>
-        <w:numPr>
-          <w:ilvl w:val="0"/>
-          <w:numId w:val="3"/>
-        </w:numPr>
-      </w:pPr>
-      <w:r>
-        <w:t>Dependency:</w:t>
-      </w:r>
-    </w:p>
-    <w:p>
-      <w:pPr>
-        <w:pStyle w:val="ListParagraph"/>
-        <w:numPr>
-          <w:ilvl w:val="1"/>
-          <w:numId w:val="3"/>
-        </w:numPr>
-      </w:pPr>
-      <w:r>
-        <w:t xml:space="preserve">Calls </w:t>
-      </w:r>
-      <w:r>
-        <w:t xml:space="preserve">shopping_list </w:t>
-      </w:r>
-      <w:r>
-        <w:t xml:space="preserve">function , expected to return a list of </w:t>
-      </w:r>
-      <w:r>
-        <w:t>each product with HTML embedding.</w:t>
+        <w:t xml:space="preserve"> shopping_list: </w:t>
+      </w:r>
+      <w:r>
+        <w:t>A list of product dictionaries.</w:t>
       </w:r>
     </w:p>
     <w:p>
@@ -4327,6 +4334,7 @@
     </w:p>
     <w:p>
       <w:r>
+        <w:lastRenderedPageBreak/>
         <w:t>Example Calls &amp; Expected Outputs</w:t>
       </w:r>
     </w:p>
@@ -4336,7 +4344,6 @@
         <w:ind w:left="1080"/>
       </w:pPr>
       <w:r>
-        <w:lastRenderedPageBreak/>
         <w:t>1.</w:t>
       </w:r>
       <w:r>
@@ -4349,7 +4356,10 @@
         <w:ind w:left="1080"/>
       </w:pPr>
       <w:r>
-        <w:t xml:space="preserve">Return </w:t>
+        <w:t>r</w:t>
+      </w:r>
+      <w:r>
+        <w:t xml:space="preserve">eturn </w:t>
       </w:r>
       <w:r>
         <w:t>shopping_list([{"title":"</w:t>
@@ -4358,25 +4368,25 @@
         <w:t>Item1</w:t>
       </w:r>
       <w:r>
-        <w:t xml:space="preserve">"},{"title":" </w:t>
+        <w:t>"},{"title":"</w:t>
       </w:r>
       <w:r>
         <w:t>Item2</w:t>
       </w:r>
       <w:r>
-        <w:t xml:space="preserve">"},{"title":" </w:t>
+        <w:t>"},{"title":"</w:t>
       </w:r>
       <w:r>
         <w:t>Item3</w:t>
       </w:r>
       <w:r>
-        <w:t xml:space="preserve">"},{"title":" </w:t>
+        <w:t>"},{"title":"</w:t>
       </w:r>
       <w:r>
         <w:t>Item4</w:t>
       </w:r>
       <w:r>
-        <w:t>"}]),"&lt;</w:t>
+        <w:t>"}])</w:t>
       </w:r>
     </w:p>
     <w:p>
@@ -4961,6 +4971,7 @@
         </w:numPr>
       </w:pPr>
       <w:r>
+        <w:lastRenderedPageBreak/>
         <w:t xml:space="preserve">Returns </w:t>
       </w:r>
       <w:r>
@@ -4972,178 +4983,243 @@
     </w:p>
     <w:p>
       <w:r>
+        <w:t>Constraints</w:t>
+      </w:r>
+    </w:p>
+    <w:p>
+      <w:pPr>
+        <w:pStyle w:val="ListParagraph"/>
+        <w:numPr>
+          <w:ilvl w:val="0"/>
+          <w:numId w:val="10"/>
+        </w:numPr>
+      </w:pPr>
+      <w:r>
+        <w:t>Slug must include only alphanumeric characters and the</w:t>
+      </w:r>
+      <w:r>
+        <w:t xml:space="preserve"> </w:t>
+      </w:r>
+      <w:r>
+        <w:t xml:space="preserve">configured separator . </w:t>
+      </w:r>
+    </w:p>
+    <w:p>
+      <w:pPr>
+        <w:pStyle w:val="ListParagraph"/>
+        <w:numPr>
+          <w:ilvl w:val="0"/>
+          <w:numId w:val="10"/>
+        </w:numPr>
+      </w:pPr>
+      <w:r>
+        <w:t>Characters listed in : ignore remain unchanged in the output .</w:t>
+      </w:r>
+    </w:p>
+    <w:p>
+      <w:pPr>
+        <w:pStyle w:val="ListParagraph"/>
+        <w:numPr>
+          <w:ilvl w:val="0"/>
+          <w:numId w:val="10"/>
+        </w:numPr>
+      </w:pPr>
+      <w:r>
+        <w:t>Punctuation is removed unless explicitly preserved via :ignore .</w:t>
+      </w:r>
+    </w:p>
+    <w:p>
+      <w:pPr>
+        <w:pStyle w:val="ListParagraph"/>
+        <w:numPr>
+          <w:ilvl w:val="0"/>
+          <w:numId w:val="10"/>
+        </w:numPr>
+      </w:pPr>
+      <w:r>
+        <w:t>Input must be valid UTF -8</w:t>
+      </w:r>
+    </w:p>
+    <w:p/>
+    <w:p>
+      <w:r>
+        <w:t>Known Edge Cases</w:t>
+      </w:r>
+    </w:p>
+    <w:p>
+      <w:pPr>
+        <w:pStyle w:val="ListParagraph"/>
+        <w:numPr>
+          <w:ilvl w:val="0"/>
+          <w:numId w:val="3"/>
+        </w:numPr>
+      </w:pPr>
+      <w:r>
+        <w:t xml:space="preserve">Empty input or punctuation - only input =&gt; returns </w:t>
+      </w:r>
+      <w:r>
+        <w:t>None</w:t>
+      </w:r>
+    </w:p>
+    <w:p>
+      <w:pPr>
+        <w:pStyle w:val="ListParagraph"/>
+        <w:numPr>
+          <w:ilvl w:val="0"/>
+          <w:numId w:val="3"/>
+        </w:numPr>
+      </w:pPr>
+      <w:r>
+        <w:t>Very small : truncate values (e .g., 1 or 2) may eliminate all words if none fit .</w:t>
+      </w:r>
+      <w:r>
+        <w:cr/>
+      </w:r>
+    </w:p>
+    <w:p>
+      <w:pPr>
+        <w:pStyle w:val="ListParagraph"/>
+        <w:numPr>
+          <w:ilvl w:val="0"/>
+          <w:numId w:val="3"/>
+        </w:numPr>
+      </w:pPr>
+      <w:r>
+        <w:t>Leading / trailing and repeated whitespace =&gt; cleaned up .</w:t>
+      </w:r>
+    </w:p>
+    <w:p>
+      <w:pPr>
+        <w:pStyle w:val="ListParagraph"/>
+        <w:ind w:left="1440"/>
+      </w:pPr>
+      <w:r>
+        <w:t>Example : " foo bar " =&gt; " foo - bar ".</w:t>
+      </w:r>
+    </w:p>
+    <w:p>
+      <w:pPr>
+        <w:pStyle w:val="ListParagraph"/>
+        <w:numPr>
+          <w:ilvl w:val="0"/>
+          <w:numId w:val="3"/>
+        </w:numPr>
+      </w:pPr>
+      <w:r>
+        <w:t>Mixed - language input =&gt; transliterated where possible ( e.g.,</w:t>
+      </w:r>
+    </w:p>
+    <w:p>
+      <w:pPr>
+        <w:pStyle w:val="ListParagraph"/>
+        <w:ind w:left="1440"/>
+      </w:pPr>
+      <w:r>
+        <w:t>"\ u4f60 \ u597d " =&gt; "ni - hao " unless ignored ) .</w:t>
+      </w:r>
+    </w:p>
+    <w:p>
+      <w:pPr>
+        <w:pStyle w:val="ListParagraph"/>
+        <w:numPr>
+          <w:ilvl w:val="0"/>
+          <w:numId w:val="3"/>
+        </w:numPr>
+      </w:pPr>
+      <w:r>
+        <w:t>Very small : truncate values (e .g., 1 or 2) may eliminate all</w:t>
+      </w:r>
+    </w:p>
+    <w:p>
+      <w:pPr>
+        <w:pStyle w:val="ListParagraph"/>
+        <w:ind w:left="1440"/>
+      </w:pPr>
+      <w:bookmarkStart w:id="0" w:name="_GoBack"/>
+      <w:bookmarkEnd w:id="0"/>
+      <w:r>
+        <w:t>words if none fit</w:t>
+      </w:r>
+    </w:p>
+    <w:p/>
+    <w:p>
+      <w:r>
+        <w:t>Example Calls &amp; Expected Outputs</w:t>
+      </w:r>
+    </w:p>
+    <w:p>
+      <w:r>
+        <w:t>slugify_manual</w:t>
+      </w:r>
+      <w:r>
+        <w:t>(</w:t>
+      </w:r>
+      <w:r>
+        <w:t>" Hello , World !"</w:t>
+      </w:r>
+      <w:r>
+        <w:t>)</w:t>
+      </w:r>
+    </w:p>
+    <w:p>
+      <w:r>
+        <w:t># =&gt; " hello - world "</w:t>
+      </w:r>
+      <w:r>
+        <w:cr/>
+      </w:r>
+      <w:r>
+        <w:t>slugify_manual(</w:t>
+      </w:r>
+      <w:r>
+        <w:t>" Madam , I ’m Adam ", separator : ""</w:t>
+      </w:r>
+      <w:r>
+        <w:t>)</w:t>
+      </w:r>
+    </w:p>
+    <w:p>
+      <w:r>
+        <w:t># =&gt; " madamimadam "</w:t>
+      </w:r>
+    </w:p>
+    <w:p>
+      <w:r>
+        <w:t>slugify_manual(</w:t>
+      </w:r>
+      <w:r>
+        <w:t>" StUdLy CaPs ", lowercase : false )</w:t>
+      </w:r>
+      <w:r>
+        <w:cr/>
+      </w:r>
+      <w:r>
+        <w:t># =&gt; " StUdLy - CaPs "</w:t>
+      </w:r>
+    </w:p>
+    <w:p>
+      <w:r>
+        <w:t>slugify_manual (" Call me maybe ", truncate : 10)</w:t>
+      </w:r>
+    </w:p>
+    <w:p>
+      <w:r>
+        <w:t>=&gt; " call - me "</w:t>
+      </w:r>
+    </w:p>
+    <w:p>
+      <w:r>
+        <w:t>slugify_manual("\ u4f60 \ u597d \ uff0c \ u4e16 \ u754c ", ignore : ["\ u4f60 ","\ u597d "])</w:t>
+      </w:r>
+    </w:p>
+    <w:p>
+      <w:r>
+        <w:t># =&gt; "\ u4f60 \ u597d - shi - jie "</w:t>
+      </w:r>
+    </w:p>
+    <w:p>
+      <w:r>
         <w:lastRenderedPageBreak/>
-        <w:t>Constraints</w:t>
-      </w:r>
-    </w:p>
-    <w:p>
-      <w:pPr>
-        <w:pStyle w:val="ListParagraph"/>
-        <w:numPr>
-          <w:ilvl w:val="0"/>
-          <w:numId w:val="10"/>
-        </w:numPr>
-      </w:pPr>
-      <w:r>
-        <w:t>Slug must include only alphanumeric characters and the</w:t>
-      </w:r>
-      <w:r>
-        <w:t xml:space="preserve"> </w:t>
-      </w:r>
-      <w:r>
-        <w:t xml:space="preserve">configured separator . </w:t>
-      </w:r>
-    </w:p>
-    <w:p>
-      <w:pPr>
-        <w:pStyle w:val="ListParagraph"/>
-        <w:numPr>
-          <w:ilvl w:val="0"/>
-          <w:numId w:val="10"/>
-        </w:numPr>
-      </w:pPr>
-      <w:r>
-        <w:t>Characters listed in : ignore remain unchanged in the output .</w:t>
-      </w:r>
-    </w:p>
-    <w:p>
-      <w:pPr>
-        <w:pStyle w:val="ListParagraph"/>
-        <w:numPr>
-          <w:ilvl w:val="0"/>
-          <w:numId w:val="10"/>
-        </w:numPr>
-      </w:pPr>
-      <w:r>
-        <w:t>Punctuation is removed unless explicitly preserved via :ignore .</w:t>
-      </w:r>
-    </w:p>
-    <w:p>
-      <w:pPr>
-        <w:pStyle w:val="ListParagraph"/>
-        <w:numPr>
-          <w:ilvl w:val="0"/>
-          <w:numId w:val="10"/>
-        </w:numPr>
-      </w:pPr>
-      <w:r>
-        <w:t>Input must be valid UTF -8</w:t>
-      </w:r>
-    </w:p>
-    <w:p/>
-    <w:p>
-      <w:r>
-        <w:t>Known Edge Cases</w:t>
-      </w:r>
-    </w:p>
-    <w:p>
-      <w:pPr>
-        <w:pStyle w:val="ListParagraph"/>
-        <w:numPr>
-          <w:ilvl w:val="0"/>
-          <w:numId w:val="3"/>
-        </w:numPr>
-      </w:pPr>
-      <w:r>
-        <w:t xml:space="preserve">Empty input or punctuation - only input =&gt; returns </w:t>
-      </w:r>
-      <w:r>
-        <w:t>None</w:t>
-      </w:r>
-    </w:p>
-    <w:p>
-      <w:pPr>
-        <w:pStyle w:val="ListParagraph"/>
-        <w:numPr>
-          <w:ilvl w:val="0"/>
-          <w:numId w:val="3"/>
-        </w:numPr>
-      </w:pPr>
-      <w:r>
-        <w:t>Very small : truncate values (e .g., 1 or 2) may eliminate all words if none fit .</w:t>
-      </w:r>
-      <w:r>
-        <w:cr/>
-      </w:r>
-    </w:p>
-    <w:p/>
-    <w:p>
-      <w:r>
-        <w:t>Example Calls &amp; Expected Outputs</w:t>
-      </w:r>
-    </w:p>
-    <w:p>
-      <w:r>
-        <w:t>slugify_manual</w:t>
-      </w:r>
-      <w:r>
-        <w:t>(</w:t>
-      </w:r>
-      <w:r>
-        <w:t>" Hello , World !"</w:t>
-      </w:r>
-      <w:r>
-        <w:t>)</w:t>
-      </w:r>
-    </w:p>
-    <w:p>
-      <w:r>
-        <w:t># =&gt; " hello - world "</w:t>
-      </w:r>
-      <w:r>
-        <w:cr/>
-      </w:r>
-      <w:r>
-        <w:t>slugify_manual(</w:t>
-      </w:r>
-      <w:r>
-        <w:t>" Madam , I ’m Adam ", separator : ""</w:t>
-      </w:r>
-      <w:r>
-        <w:t>)</w:t>
-      </w:r>
-    </w:p>
-    <w:p>
-      <w:r>
-        <w:t># =&gt; " madamimadam "</w:t>
-      </w:r>
-    </w:p>
-    <w:p>
-      <w:r>
-        <w:t>slugify_manual(</w:t>
-      </w:r>
-      <w:r>
-        <w:t>" StUdLy CaPs ", lowercase : false )</w:t>
-      </w:r>
-      <w:r>
-        <w:cr/>
-      </w:r>
-      <w:r>
-        <w:t># =&gt; " StUdLy - CaPs "</w:t>
-      </w:r>
-    </w:p>
-    <w:p>
-      <w:r>
-        <w:t>slugify_manual (" Call me maybe ", truncate : 10)</w:t>
-      </w:r>
-    </w:p>
-    <w:p>
-      <w:r>
-        <w:t>=&gt; " call - me "</w:t>
-      </w:r>
-    </w:p>
-    <w:p>
-      <w:r>
-        <w:t>slugify_manual("\ u4f60 \ u597d \ uff0c \ u4e16 \ u754c ", ignore : ["\ u4f60 ","\ u597d "])</w:t>
-      </w:r>
-    </w:p>
-    <w:p>
-      <w:r>
-        <w:t># =&gt; "\ u4f60 \ u597d - shi - jie "</w:t>
-      </w:r>
-    </w:p>
-    <w:p>
-      <w:r>
         <w:tab/>
         <w:t xml:space="preserve"> </w:t>
       </w:r>
@@ -5190,55 +5266,19 @@
         <w:ind w:left="1080"/>
       </w:pPr>
     </w:p>
-    <w:p>
-      <w:pPr>
-        <w:pStyle w:val="ListParagraph"/>
-        <w:ind w:left="1080"/>
-      </w:pPr>
-    </w:p>
-    <w:p>
-      <w:pPr>
-        <w:pStyle w:val="ListParagraph"/>
-        <w:ind w:left="1080"/>
-      </w:pPr>
-    </w:p>
-    <w:p>
-      <w:pPr>
-        <w:pStyle w:val="ListParagraph"/>
-        <w:ind w:left="1080"/>
-      </w:pPr>
-    </w:p>
-    <w:p>
-      <w:pPr>
-        <w:pStyle w:val="ListParagraph"/>
-        <w:ind w:left="1080"/>
-      </w:pPr>
-    </w:p>
-    <w:p>
-      <w:pPr>
-        <w:pStyle w:val="ListParagraph"/>
-        <w:ind w:left="1080"/>
-      </w:pPr>
-    </w:p>
-    <w:p>
-      <w:pPr>
-        <w:pStyle w:val="ListParagraph"/>
-        <w:ind w:left="1080"/>
-      </w:pPr>
-    </w:p>
-    <w:p>
-      <w:pPr>
-        <w:pStyle w:val="ListParagraph"/>
-        <w:ind w:left="1080"/>
-      </w:pPr>
-    </w:p>
-    <w:p>
-      <w:pPr>
-        <w:pStyle w:val="ListParagraph"/>
-        <w:ind w:left="1080"/>
-      </w:pPr>
-    </w:p>
-    <w:p>
+    <w:p/>
+    <w:p>
+      <w:pPr>
+        <w:pStyle w:val="ListParagraph"/>
+        <w:ind w:left="1080"/>
+      </w:pPr>
+    </w:p>
+    <w:p>
+      <w:pPr>
+        <w:rPr>
+          <w:lang w:val="en-GB"/>
+        </w:rPr>
+      </w:pPr>
       <w:r>
         <w:t>Module Name: product_cache</w:t>
       </w:r>
@@ -5286,6 +5326,9 @@
     <w:p>
       <w:pPr>
         <w:ind w:right="-705"/>
+        <w:rPr>
+          <w:lang w:val="en-GB"/>
+        </w:rPr>
       </w:pPr>
       <w:r>
         <w:t xml:space="preserve">    def delete(self,key):</w:t>
@@ -5314,7 +5357,13 @@
         </w:numPr>
       </w:pPr>
       <w:r>
-        <w:t>Stores product data in an in - memory ETS table for fast retrieval .</w:t>
+        <w:t>Stores product data in</w:t>
+      </w:r>
+      <w:r>
+        <w:t xml:space="preserve"> dictionary</w:t>
+      </w:r>
+      <w:r>
+        <w:t xml:space="preserve"> for fast retrieval .</w:t>
       </w:r>
     </w:p>
     <w:p>
@@ -5426,6 +5475,7 @@
         </w:numPr>
       </w:pPr>
       <w:r>
+        <w:lastRenderedPageBreak/>
         <w:t>Key :</w:t>
       </w:r>
       <w:r>
@@ -5465,7 +5515,6 @@
         </w:numPr>
       </w:pPr>
       <w:r>
-        <w:lastRenderedPageBreak/>
         <w:t>For delete</w:t>
       </w:r>
     </w:p>
@@ -5542,36 +5591,73 @@
     </w:p>
     <w:p>
       <w:r>
-        <w:t>Constraints</w:t>
-      </w:r>
-    </w:p>
-    <w:p>
-      <w:pPr>
-        <w:pStyle w:val="ListParagraph"/>
-        <w:numPr>
-          <w:ilvl w:val="0"/>
-          <w:numId w:val="10"/>
-        </w:numPr>
-      </w:pPr>
-      <w:r>
-        <w:t>Cache operations should be non - blocking and optimized for</w:t>
+        <w:t>Known Edge cases</w:t>
+      </w:r>
+    </w:p>
+    <w:p>
+      <w:pPr>
+        <w:pStyle w:val="ListParagraph"/>
+        <w:numPr>
+          <w:ilvl w:val="0"/>
+          <w:numId w:val="11"/>
+        </w:numPr>
+      </w:pPr>
+      <w:r>
+        <w:t>If a requested key doesn ’ t exist</w:t>
+      </w:r>
+      <w:r>
+        <w:t xml:space="preserve"> return None</w:t>
+      </w:r>
+      <w:r>
+        <w:t>.</w:t>
+      </w:r>
+    </w:p>
+    <w:p>
+      <w:pPr>
+        <w:pStyle w:val="ListParagraph"/>
+        <w:numPr>
+          <w:ilvl w:val="0"/>
+          <w:numId w:val="11"/>
+        </w:numPr>
+      </w:pPr>
+      <w:r>
+        <w:t>Setting a value with a negative TTL immediately invalidates it</w:t>
+      </w:r>
+    </w:p>
+    <w:p>
+      <w:pPr>
+        <w:pStyle w:val="ListParagraph"/>
+        <w:numPr>
+          <w:ilvl w:val="0"/>
+          <w:numId w:val="11"/>
+        </w:numPr>
+      </w:pPr>
+      <w:r>
+        <w:t xml:space="preserve">Calling </w:t>
+      </w:r>
+      <w:r>
+        <w:t xml:space="preserve">cleanup () </w:t>
+      </w:r>
+      <w:r>
+        <w:t>clears all cached items , regardless of their</w:t>
       </w:r>
       <w:r>
         <w:t xml:space="preserve"> </w:t>
       </w:r>
       <w:r>
-        <w:t>concurrent access</w:t>
-      </w:r>
-      <w:r>
-        <w:cr/>
-      </w:r>
-      <w:r>
-        <w:cr/>
-      </w:r>
-    </w:p>
-    <w:p>
-      <w:r>
-        <w:t>Known Edge cases</w:t>
+        <w:t>TTL</w:t>
+      </w:r>
+      <w:r>
+        <w:t xml:space="preserve"> and returns </w:t>
+      </w:r>
+      <w:r>
+        <w:t>“</w:t>
+      </w:r>
+      <w:r>
+        <w:t>Cleaned successfully</w:t>
+      </w:r>
+      <w:r>
+        <w:t>”.</w:t>
       </w:r>
     </w:p>
     <w:p>
@@ -5583,70 +5669,10 @@
         </w:numPr>
       </w:pPr>
       <w:r>
-        <w:t>If a requested key doesn ’ t exist</w:t>
-      </w:r>
-      <w:r>
-        <w:t xml:space="preserve"> return None</w:t>
-      </w:r>
-      <w:r>
-        <w:t>.</w:t>
-      </w:r>
-    </w:p>
-    <w:p>
-      <w:pPr>
-        <w:pStyle w:val="ListParagraph"/>
-        <w:numPr>
-          <w:ilvl w:val="0"/>
-          <w:numId w:val="11"/>
-        </w:numPr>
-      </w:pPr>
-      <w:r>
-        <w:t>Setting a value with a negative TTL immediately invalidates it</w:t>
-      </w:r>
-    </w:p>
-    <w:p>
-      <w:pPr>
-        <w:pStyle w:val="ListParagraph"/>
-        <w:numPr>
-          <w:ilvl w:val="0"/>
-          <w:numId w:val="11"/>
-        </w:numPr>
-      </w:pPr>
-      <w:r>
         <w:t xml:space="preserve">Calling </w:t>
       </w:r>
       <w:r>
-        <w:t xml:space="preserve">cleanup () </w:t>
-      </w:r>
-      <w:r>
-        <w:t>clears all cached items , regardless of their</w:t>
-      </w:r>
-      <w:r>
-        <w:t xml:space="preserve"> </w:t>
-      </w:r>
-      <w:r>
-        <w:t>TTL</w:t>
-      </w:r>
-    </w:p>
-    <w:p>
-      <w:pPr>
-        <w:pStyle w:val="ListParagraph"/>
-        <w:numPr>
-          <w:ilvl w:val="0"/>
-          <w:numId w:val="11"/>
-        </w:numPr>
-      </w:pPr>
-      <w:r>
-        <w:t>If the process crashes , all cached data is lost ( no</w:t>
-      </w:r>
-      <w:r>
-        <w:t xml:space="preserve"> </w:t>
-      </w:r>
-      <w:r>
-        <w:t>persistence )</w:t>
-      </w:r>
-      <w:r>
-        <w:cr/>
+        <w:t xml:space="preserve"> delete () should remove the product desired and return “deleted successfully”</w:t>
       </w:r>
     </w:p>
     <w:p>
@@ -5741,15 +5767,15 @@
     <w:p/>
     <w:p>
       <w:r>
+        <w:t xml:space="preserve">4. </w:t>
+      </w:r>
+      <w:r>
+        <w:t>Getting a non - existent key</w:t>
+      </w:r>
+    </w:p>
+    <w:p>
+      <w:r>
         <w:lastRenderedPageBreak/>
-        <w:t xml:space="preserve">4. </w:t>
-      </w:r>
-      <w:r>
-        <w:t>Getting a non - existent key</w:t>
-      </w:r>
-    </w:p>
-    <w:p>
-      <w:r>
         <w:t>Cache.</w:t>
       </w:r>
       <w:r>

</xml_diff>